<commit_message>
Setima auditoria: corrige a Tabela 4 do event study, o ancora de 2025, o README e as referencias ao CHANGELOG
</commit_message>
<xml_diff>
--- a/deliverables/EGMS_01_resumo_executivo.docx
+++ b/deliverables/EGMS_01_resumo_executivo.docx
@@ -58,13 +58,11 @@
           <w:sz w:val="18"/>
           <w:szCs w:val="18"/>
         </w:rPr>
-        <w:t xml:space="preserve">resumo executivo · julho de 2026</w:t>
-      </w:r>
-    </w:p>
-    <w:p>
-      <w:pPr>
-        <w:ind w:firstLine="709"/>
-      </w:pPr>
+        <w:t xml:space="preserve">resumo executivo · agosto de 2026</w:t>
+      </w:r>
+    </w:p>
+    <w:p>
+      <w:pPr/>
       <w:r>
         <w:br w:type="page"/>
       </w:r>
@@ -174,7 +172,7 @@
         <w:t xml:space="preserve">Stack e auditabilidade. </w:t>
       </w:r>
       <w:r>
-        <w:t xml:space="preserve">DuckDB + SQL em camadas puras (staging → marts → analytics) + R (validação com stopifnot) + Power BI sobre 3 parquets. 56 checks com valores esperados versionados no próprio pipeline; toda decisão de fórmula tem teste empírico documentado (piso do denominador, limiar de materialidade, média 0-fill, deflator); seis auditorias adversariais independentes, cada uma replicando o pipeline a partir dos dados brutos em ambiente isolado. A última (jul/2026) reproduziu os 56 checks e os coeficientes de painel.</w:t>
+        <w:t xml:space="preserve">DuckDB + SQL em camadas puras (staging → marts → analytics) + R (validação com stopifnot) + Power BI sobre 3 parquets. 56 checks com valores esperados versionados no próprio pipeline; toda decisão de fórmula tem teste empírico documentado (piso do denominador, limiar de materialidade, média 0-fill, deflator); sucessivas auditorias adversariais independentes, cada uma replicando o pipeline a partir dos dados brutos em ambiente isolado. A mais recente (ago/2026) reproduziu os 56 checks e os coeficientes de painel.</w:t>
       </w:r>
     </w:p>
     <w:p>
@@ -203,9 +201,7 @@
       </w:r>
     </w:p>
     <w:p>
-      <w:pPr>
-        <w:ind w:firstLine="709"/>
-      </w:pPr>
+      <w:pPr/>
       <w:r>
         <w:br w:type="page"/>
       </w:r>
@@ -458,7 +454,7 @@
         <w:jc w:val="left"/>
       </w:pPr>
       <w:r>
-        <w:t xml:space="preserve">BRASIL. Ministério do Meio Ambiente e Mudança do Clima (MMA). Portaria GM/MMA nº 1.202, de 11 de novembro de 2024. Dispõe sobre a atualização da lista de municípios prioritários para ações de prevenção, controle e redução dos desmatamentos e degradação florestal, e da lista de municípios com desmatamento monitorado e sob controle. Brasília, DF: Diário Oficial da União, ed. 220, seção 1, p. 121, 13 nov. 2024. Disponível em: https://www.in.gov.br/web/dou/-/portaria-gm/mma-n-1.202-de-11-de-novembro-de-2024-595667200. Acesso em: 27 jul. 2026.</w:t>
+        <w:t xml:space="preserve">BRASIL. Instituto Nacional de Pesquisas Espaciais (INPE). PRODES: monitoramento do desmatamento da floresta amazônica brasileira por satélite. TerraBrasilis. São José dos Campos: INPE. Disponível em: https://terrabrasilis.dpi.inpe.br/. Acesso em: 25 abr. 2026.</w:t>
       </w:r>
     </w:p>
     <w:p>
@@ -467,7 +463,7 @@
         <w:jc w:val="left"/>
       </w:pPr>
       <w:r>
-        <w:t xml:space="preserve">INSTITUTO BRASILEIRO DE GEOGRAFIA E ESTATÍSTICA (IBGE). Sistema IBGE de Recuperação Automática (SIDRA). Tabela 1737: Índice Nacional de Preços ao Consumidor Amplo (IPCA), variável 2266 (número-índice, dez. 1993=100). Rio de Janeiro: IBGE. Disponível em: https://sidra.ibge.gov.br/tabela/1737. Acesso em: 10 jul. 2026.</w:t>
+        <w:t xml:space="preserve">BRASIL. Ministério do Meio Ambiente e Mudança do Clima (MMA). Portaria GM/MMA nº 1.202, de 11 de novembro de 2024. Dispõe sobre a atualização da lista de municípios prioritários para ações de prevenção, controle e redução dos desmatamentos e degradação florestal, e da lista de municípios com desmatamento monitorado e sob controle. Brasília, DF: Diário Oficial da União, ed. 220, seção 1, p. 121, 13 nov. 2024. Disponível em: https://www.in.gov.br/web/dou/-/portaria-gm/mma-n-1.202-de-11-de-novembro-de-2024-595667200. Acesso em: 27 jul. 2026.</w:t>
       </w:r>
     </w:p>
     <w:p>
@@ -476,7 +472,7 @@
         <w:jc w:val="left"/>
       </w:pPr>
       <w:r>
-        <w:t xml:space="preserve">INSTITUTO NACIONAL DE PESQUISAS ESPACIAIS (INPE). PRODES: monitoramento do desmatamento da floresta amazônica brasileira por satélite. TerraBrasilis. São José dos Campos: INPE. Disponível em: https://terrabrasilis.dpi.inpe.br/. Acesso em: 25 abr. 2026.</w:t>
+        <w:t xml:space="preserve">INSTITUTO BRASILEIRO DE GEOGRAFIA E ESTATÍSTICA (IBGE). Sistema IBGE de Recuperação Automática (SIDRA). Tabela 1737: Índice Nacional de Preços ao Consumidor Amplo (IPCA), variável 2266 (número-índice, dez. 1993=100). Rio de Janeiro: IBGE. Disponível em: https://sidra.ibge.gov.br/tabela/1737. Acesso em: 10 jul. 2026.</w:t>
       </w:r>
     </w:p>
     <w:sectPr>

</xml_diff>

<commit_message>
Harmoniza numeracao das figuras, remove as sem uso e enxuga os READMEs
</commit_message>
<xml_diff>
--- a/deliverables/EGMS_01_resumo_executivo.docx
+++ b/deliverables/EGMS_01_resumo_executivo.docx
@@ -197,7 +197,7 @@
         <w:t xml:space="preserve">federal</w:t>
       </w:r>
       <w:r>
-        <w:t xml:space="preserve"> (aparatos estaduais ativos, como SEMAS-PA e IPAAM, são invisíveis ao dado); PRODES não distingue desmatamento autorizado de ilegal; a resposta é medida por autos lavrados, não por embargos ou arrecadação; o EGS é ordinal. Cada posição do ranking é uma hipótese priorizada para investigação: não um veredito.</w:t>
+        <w:t xml:space="preserve"> (aparatos estaduais ativos, como SEMAS-PA e IPAAM, são invisíveis ao dado, e mesmo no plano federal só entram autos de tipo desmatamento: 34% dos que o IBAMA lavrou no top 20); PRODES não distingue desmatamento autorizado de ilegal; a resposta é medida por autos lavrados, não por embargos ou arrecadação; o EGS é ordinal. Cada posição do ranking é uma hipótese priorizada para investigação: não um veredito.</w:t>
       </w:r>
     </w:p>
     <w:p>
@@ -259,7 +259,7 @@
               <a:graphicData uri="http://schemas.openxmlformats.org/drawingml/2006/picture">
                 <pic:pic>
                   <pic:nvPicPr>
-                    <pic:cNvPr id="0" name="01c_egs_mean18y.png"/>
+                    <pic:cNvPr id="0" name="02_egs_mean18y.png"/>
                     <pic:cNvPicPr/>
                   </pic:nvPicPr>
                   <pic:blipFill>
@@ -292,7 +292,7 @@
           <w:color w:val="000000"/>
           <w:sz w:val="18"/>
         </w:rPr>
-        <w:t>Figura 1. Enforcement Gap Score médio (2008–2025) por quintil. Escala ordinal (rank), nunca valor bruto; pinos verdes = top 20 do ranking.</w:t>
+        <w:t>Figura 1. Enforcement Gap Score médio (2008–2025) por quintil. Escala ordinal (rank), nunca valor bruto; contorno grosso = top 20 do ranking.</w:t>
       </w:r>
     </w:p>
     <w:p>
@@ -327,7 +327,7 @@
               <a:graphicData uri="http://schemas.openxmlformats.org/drawingml/2006/picture">
                 <pic:pic>
                   <pic:nvPicPr>
-                    <pic:cNvPr id="0" name="01d_bivariate_map.png"/>
+                    <pic:cNvPr id="0" name="03_bivariate_map.png"/>
                     <pic:cNvPicPr/>
                   </pic:nvPicPr>
                   <pic:blipFill>

</xml_diff>

<commit_message>
viz: 18 figuras renumeradas, denominador mapeado, uma rampa por quantidade
- cinco mapas na ordem que constroi o indice, antigas 4-16 deslocadas para 6-18
- mapa bivariado dividido em % desmatado e resposta federal
- figura 3 passa a mapear o denominador (media geometrica de autos e multas)
- quintis sobre populacao unica, 552 com pressao, 220 como categoria
- rampa por quantidade: marrom numerador, azul denominador, ameixa EGS
- divisas estaduais e contorno do top 20 com traco duplo
- relatorio: secao 4.4 nova, 8.1 reescrita, secao 8 reordenada, 3.2 e 6 ampliadas
- references/verificacao_coordenadas.R, fora do pipeline
- CHANGELOG 1.1.0, CITATION.cff e capa do relatorio
</commit_message>
<xml_diff>
--- a/deliverables/EGMS_01_resumo_executivo.docx
+++ b/deliverables/EGMS_01_resumo_executivo.docx
@@ -292,7 +292,7 @@
           <w:color w:val="000000"/>
           <w:sz w:val="18"/>
         </w:rPr>
-        <w:t>Figura 1. Enforcement Gap Score médio (2008–2025) por quintil. Escala ordinal (rank), nunca valor bruto; contorno grosso = top 20 do ranking.</w:t>
+        <w:t>Figura 1. Enforcement Gap Score médio (2008-2025) por quintil. Escala ordinal (rank), nunca valor bruto; contorno grosso = top 20 do ranking.</w:t>
       </w:r>
     </w:p>
     <w:p>
@@ -308,7 +308,7 @@
         <w:ind w:firstLine="709"/>
       </w:pPr>
       <w:r>
-        <w:t xml:space="preserve">Este mapa bivariado combina duas informações no mesmo desenho: a cor mostra o quintil de desmatamento percentual e o tamanho da bolha mostra o total de multas aplicadas, com contorno para o top 20 em EGS, permitindo ver de forma direta onde pressão alta coincide (ou não) com resposta robusta.</w:t>
+        <w:t xml:space="preserve">O mapa mostra o lado da resposta federal, combinando as duas coisas que o índice mede: quantos autos foram lavrados e quanto foi multado. Um único auto de valor alto não conta como resposta robusta, por construção. Duas categorias ficam fora da escala e são o que mais interessa ao gestor: em vermelho, os 66 municípios que tiveram pressão material e nunca foram multados em dezoito anos; em cinza, os 220 sem pressão medida. Lido ao lado da figura 1, mostra onde a resposta acompanha a lacuna e onde não acompanha.</w:t>
       </w:r>
     </w:p>
     <w:p>
@@ -360,7 +360,7 @@
           <w:color w:val="000000"/>
           <w:sz w:val="18"/>
         </w:rPr>
-        <w:t>Figura 2. Exposição ao desmatamento (cor = quintil de % desmatado) versus resposta federal (bolha com área ∝ multas deflacionadas); contorno grosso = top 20 EGS.</w:t>
+        <w:t>Figura 2. Resposta federal por quintil (autos e multas deflacionadas combinados); vermelho = pressão material sem nenhuma multa (66 municípios); cinza = sem pressão medida; contorno grosso = top 20 EGS.</w:t>
       </w:r>
     </w:p>
     <w:p>

</xml_diff>

<commit_message>
viz+docs: auditoria visual aplicada nas 11 figuras e nos 3 relatorios
Siglas dos 9 estados nos mapas; categorias fora da ordem da rampa nas legendas; denominador nomeado corretamente na figura 1 e na 4; zeros estruturais vazados na figura 9; piso do denominador anotado; OUTCOME_COLOURS invertido; geom_line do event study removido e dodge 0,15. Tabela do top 20 no resumo executivo; figuras 2 e 3 frente a frente no estendido; tres legendas reescritas. 01_egs_formula.png versionada estava atras do pipeline.
</commit_message>
<xml_diff>
--- a/deliverables/EGMS_01_resumo_executivo.docx
+++ b/deliverables/EGMS_01_resumo_executivo.docx
@@ -143,6 +143,3002 @@
       </w:r>
       <w:r>
         <w:t xml:space="preserve">Das 13.896 observações, 54,3% não têm pressão material; 22,0% são lacunas absolutas (desmatamento detectado, nenhuma multa federal no ano); 23,6% são lacunas medidas. O topo do ranking é estrutural, não episódico: os 20 primeiros têm pressão material em todos os 18 anos, sendo 16 no Pará, 2 no Maranhão e 2 no Amazonas. O caso nº 1, Cachoeira do Piriá (PA): 410 km² desmatados contra 13 autos e R$ 4,3 milhões em 18 anos. Nove dos vinte constam da lista oficial de municípios prioritários do MMA (Portaria GM/MMA nº 1.202/2024, Anexo I, 81 municípios): convergência de metodologias independentes em 45% do topo. Os nove ocupam as posições 8 a 17; nenhum dos sete primeiros consta da lista, que é construída por volume bruto de desmatamento.</w:t>
+      </w:r>
+    </w:p>
+    <w:tbl>
+      <w:tblPr>
+        <w:tblW w:type="dxa" w:w="6700"/>
+        <w:tblBorders>
+          <w:top w:val="single" w:color="auto" w:sz="4"/>
+          <w:left w:val="single" w:color="auto" w:sz="4"/>
+          <w:bottom w:val="single" w:color="auto" w:sz="4"/>
+          <w:right w:val="single" w:color="auto" w:sz="4"/>
+          <w:insideH w:val="single" w:color="auto" w:sz="4"/>
+          <w:insideV w:val="single" w:color="auto" w:sz="4"/>
+        </w:tblBorders>
+      </w:tblPr>
+      <w:tblGrid>
+        <w:gridCol w:w="450"/>
+        <w:gridCol w:w="2500"/>
+        <w:gridCol w:w="550"/>
+        <w:gridCol w:w="1000"/>
+        <w:gridCol w:w="1100"/>
+        <w:gridCol w:w="1100"/>
+      </w:tblGrid>
+      <w:tr>
+        <w:trPr>
+          <w:cantSplit/>
+          <w:tblHeader/>
+        </w:trPr>
+        <w:tc>
+          <w:tcPr>
+            <w:tcW w:type="dxa" w:w="450"/>
+            <w:shd w:fill="DDE5DC" w:val="clear"/>
+            <w:tcMar>
+              <w:top w:type="dxa" w:w="50"/>
+              <w:left w:type="dxa" w:w="90"/>
+              <w:bottom w:type="dxa" w:w="50"/>
+              <w:right w:type="dxa" w:w="90"/>
+            </w:tcMar>
+          </w:tcPr>
+          <w:p>
+            <w:pPr>
+              <w:spacing w:after="0"/>
+            </w:pPr>
+            <w:r>
+              <w:rPr>
+                <w:b/>
+                <w:bCs/>
+                <w:sz w:val="17"/>
+                <w:szCs w:val="17"/>
+              </w:rPr>
+              <w:t xml:space="preserve">#</w:t>
+            </w:r>
+          </w:p>
+        </w:tc>
+        <w:tc>
+          <w:tcPr>
+            <w:tcW w:type="dxa" w:w="2500"/>
+            <w:shd w:fill="DDE5DC" w:val="clear"/>
+            <w:tcMar>
+              <w:top w:type="dxa" w:w="50"/>
+              <w:left w:type="dxa" w:w="90"/>
+              <w:bottom w:type="dxa" w:w="50"/>
+              <w:right w:type="dxa" w:w="90"/>
+            </w:tcMar>
+          </w:tcPr>
+          <w:p>
+            <w:pPr>
+              <w:spacing w:after="0"/>
+            </w:pPr>
+            <w:r>
+              <w:rPr>
+                <w:b/>
+                <w:bCs/>
+                <w:sz w:val="17"/>
+                <w:szCs w:val="17"/>
+              </w:rPr>
+              <w:t xml:space="preserve">Município</w:t>
+            </w:r>
+          </w:p>
+        </w:tc>
+        <w:tc>
+          <w:tcPr>
+            <w:tcW w:type="dxa" w:w="550"/>
+            <w:shd w:fill="DDE5DC" w:val="clear"/>
+            <w:tcMar>
+              <w:top w:type="dxa" w:w="50"/>
+              <w:left w:type="dxa" w:w="90"/>
+              <w:bottom w:type="dxa" w:w="50"/>
+              <w:right w:type="dxa" w:w="90"/>
+            </w:tcMar>
+          </w:tcPr>
+          <w:p>
+            <w:pPr>
+              <w:spacing w:after="0"/>
+            </w:pPr>
+            <w:r>
+              <w:rPr>
+                <w:b/>
+                <w:bCs/>
+                <w:sz w:val="17"/>
+                <w:szCs w:val="17"/>
+              </w:rPr>
+              <w:t xml:space="preserve">UF</w:t>
+            </w:r>
+          </w:p>
+        </w:tc>
+        <w:tc>
+          <w:tcPr>
+            <w:tcW w:type="dxa" w:w="1000"/>
+            <w:shd w:fill="DDE5DC" w:val="clear"/>
+            <w:tcMar>
+              <w:top w:type="dxa" w:w="50"/>
+              <w:left w:type="dxa" w:w="90"/>
+              <w:bottom w:type="dxa" w:w="50"/>
+              <w:right w:type="dxa" w:w="90"/>
+            </w:tcMar>
+          </w:tcPr>
+          <w:p>
+            <w:pPr>
+              <w:spacing w:after="0"/>
+            </w:pPr>
+            <w:r>
+              <w:rPr>
+                <w:b/>
+                <w:bCs/>
+                <w:sz w:val="17"/>
+                <w:szCs w:val="17"/>
+              </w:rPr>
+              <w:t xml:space="preserve">EGS 18a</w:t>
+            </w:r>
+          </w:p>
+        </w:tc>
+        <w:tc>
+          <w:tcPr>
+            <w:tcW w:type="dxa" w:w="1100"/>
+            <w:shd w:fill="DDE5DC" w:val="clear"/>
+            <w:tcMar>
+              <w:top w:type="dxa" w:w="50"/>
+              <w:left w:type="dxa" w:w="90"/>
+              <w:bottom w:type="dxa" w:w="50"/>
+              <w:right w:type="dxa" w:w="90"/>
+            </w:tcMar>
+          </w:tcPr>
+          <w:p>
+            <w:pPr>
+              <w:spacing w:after="0"/>
+            </w:pPr>
+            <w:r>
+              <w:rPr>
+                <w:b/>
+                <w:bCs/>
+                <w:sz w:val="17"/>
+                <w:szCs w:val="17"/>
+              </w:rPr>
+              <w:t xml:space="preserve">Anos de lacuna absoluta</w:t>
+            </w:r>
+          </w:p>
+        </w:tc>
+        <w:tc>
+          <w:tcPr>
+            <w:tcW w:type="dxa" w:w="1100"/>
+            <w:shd w:fill="DDE5DC" w:val="clear"/>
+            <w:tcMar>
+              <w:top w:type="dxa" w:w="50"/>
+              <w:left w:type="dxa" w:w="90"/>
+              <w:bottom w:type="dxa" w:w="50"/>
+              <w:right w:type="dxa" w:w="90"/>
+            </w:tcMar>
+          </w:tcPr>
+          <w:p>
+            <w:pPr>
+              <w:spacing w:after="0"/>
+            </w:pPr>
+            <w:r>
+              <w:rPr>
+                <w:b/>
+                <w:bCs/>
+                <w:sz w:val="17"/>
+                <w:szCs w:val="17"/>
+              </w:rPr>
+              <w:t xml:space="preserve">Anos de lacuna medida</w:t>
+            </w:r>
+          </w:p>
+        </w:tc>
+      </w:tr>
+      <w:tr>
+        <w:tc>
+          <w:tcPr>
+            <w:tcW w:type="dxa" w:w="450"/>
+            <w:tcMar>
+              <w:top w:type="dxa" w:w="40"/>
+              <w:left w:type="dxa" w:w="90"/>
+              <w:bottom w:type="dxa" w:w="40"/>
+              <w:right w:type="dxa" w:w="90"/>
+            </w:tcMar>
+          </w:tcPr>
+          <w:p>
+            <w:pPr>
+              <w:spacing w:after="0"/>
+            </w:pPr>
+            <w:r>
+              <w:rPr>
+                <w:sz w:val="17"/>
+                <w:szCs w:val="17"/>
+              </w:rPr>
+              <w:t xml:space="preserve">1</w:t>
+            </w:r>
+          </w:p>
+        </w:tc>
+        <w:tc>
+          <w:tcPr>
+            <w:tcW w:type="dxa" w:w="2500"/>
+            <w:tcMar>
+              <w:top w:type="dxa" w:w="40"/>
+              <w:left w:type="dxa" w:w="90"/>
+              <w:bottom w:type="dxa" w:w="40"/>
+              <w:right w:type="dxa" w:w="90"/>
+            </w:tcMar>
+          </w:tcPr>
+          <w:p>
+            <w:pPr>
+              <w:spacing w:after="0"/>
+            </w:pPr>
+            <w:r>
+              <w:rPr>
+                <w:sz w:val="17"/>
+                <w:szCs w:val="17"/>
+              </w:rPr>
+              <w:t xml:space="preserve">Cachoeira do Piriá</w:t>
+            </w:r>
+          </w:p>
+        </w:tc>
+        <w:tc>
+          <w:tcPr>
+            <w:tcW w:type="dxa" w:w="550"/>
+            <w:tcMar>
+              <w:top w:type="dxa" w:w="40"/>
+              <w:left w:type="dxa" w:w="90"/>
+              <w:bottom w:type="dxa" w:w="40"/>
+              <w:right w:type="dxa" w:w="90"/>
+            </w:tcMar>
+          </w:tcPr>
+          <w:p>
+            <w:pPr>
+              <w:spacing w:after="0"/>
+            </w:pPr>
+            <w:r>
+              <w:rPr>
+                <w:sz w:val="17"/>
+                <w:szCs w:val="17"/>
+              </w:rPr>
+              <w:t xml:space="preserve">PA</w:t>
+            </w:r>
+          </w:p>
+        </w:tc>
+        <w:tc>
+          <w:tcPr>
+            <w:tcW w:type="dxa" w:w="1000"/>
+            <w:tcMar>
+              <w:top w:type="dxa" w:w="40"/>
+              <w:left w:type="dxa" w:w="90"/>
+              <w:bottom w:type="dxa" w:w="40"/>
+              <w:right w:type="dxa" w:w="90"/>
+            </w:tcMar>
+          </w:tcPr>
+          <w:p>
+            <w:pPr>
+              <w:spacing w:after="0"/>
+            </w:pPr>
+            <w:r>
+              <w:rPr>
+                <w:sz w:val="17"/>
+                <w:szCs w:val="17"/>
+              </w:rPr>
+              <w:t xml:space="preserve">1,179</w:t>
+            </w:r>
+          </w:p>
+        </w:tc>
+        <w:tc>
+          <w:tcPr>
+            <w:tcW w:type="dxa" w:w="1100"/>
+            <w:tcMar>
+              <w:top w:type="dxa" w:w="40"/>
+              <w:left w:type="dxa" w:w="90"/>
+              <w:bottom w:type="dxa" w:w="40"/>
+              <w:right w:type="dxa" w:w="90"/>
+            </w:tcMar>
+          </w:tcPr>
+          <w:p>
+            <w:pPr>
+              <w:spacing w:after="0"/>
+            </w:pPr>
+            <w:r>
+              <w:rPr>
+                <w:sz w:val="17"/>
+                <w:szCs w:val="17"/>
+              </w:rPr>
+              <w:t xml:space="preserve">13</w:t>
+            </w:r>
+          </w:p>
+        </w:tc>
+        <w:tc>
+          <w:tcPr>
+            <w:tcW w:type="dxa" w:w="1100"/>
+            <w:tcMar>
+              <w:top w:type="dxa" w:w="40"/>
+              <w:left w:type="dxa" w:w="90"/>
+              <w:bottom w:type="dxa" w:w="40"/>
+              <w:right w:type="dxa" w:w="90"/>
+            </w:tcMar>
+          </w:tcPr>
+          <w:p>
+            <w:pPr>
+              <w:spacing w:after="0"/>
+            </w:pPr>
+            <w:r>
+              <w:rPr>
+                <w:sz w:val="17"/>
+                <w:szCs w:val="17"/>
+              </w:rPr>
+              <w:t xml:space="preserve">5</w:t>
+            </w:r>
+          </w:p>
+        </w:tc>
+      </w:tr>
+      <w:tr>
+        <w:tc>
+          <w:tcPr>
+            <w:tcW w:type="dxa" w:w="450"/>
+            <w:tcMar>
+              <w:top w:type="dxa" w:w="40"/>
+              <w:left w:type="dxa" w:w="90"/>
+              <w:bottom w:type="dxa" w:w="40"/>
+              <w:right w:type="dxa" w:w="90"/>
+            </w:tcMar>
+          </w:tcPr>
+          <w:p>
+            <w:pPr>
+              <w:spacing w:after="0"/>
+            </w:pPr>
+            <w:r>
+              <w:rPr>
+                <w:sz w:val="17"/>
+                <w:szCs w:val="17"/>
+              </w:rPr>
+              <w:t xml:space="preserve">2</w:t>
+            </w:r>
+          </w:p>
+        </w:tc>
+        <w:tc>
+          <w:tcPr>
+            <w:tcW w:type="dxa" w:w="2500"/>
+            <w:tcMar>
+              <w:top w:type="dxa" w:w="40"/>
+              <w:left w:type="dxa" w:w="90"/>
+              <w:bottom w:type="dxa" w:w="40"/>
+              <w:right w:type="dxa" w:w="90"/>
+            </w:tcMar>
+          </w:tcPr>
+          <w:p>
+            <w:pPr>
+              <w:spacing w:after="0"/>
+            </w:pPr>
+            <w:r>
+              <w:rPr>
+                <w:sz w:val="17"/>
+                <w:szCs w:val="17"/>
+              </w:rPr>
+              <w:t xml:space="preserve">Porto de Moz</w:t>
+            </w:r>
+          </w:p>
+        </w:tc>
+        <w:tc>
+          <w:tcPr>
+            <w:tcW w:type="dxa" w:w="550"/>
+            <w:tcMar>
+              <w:top w:type="dxa" w:w="40"/>
+              <w:left w:type="dxa" w:w="90"/>
+              <w:bottom w:type="dxa" w:w="40"/>
+              <w:right w:type="dxa" w:w="90"/>
+            </w:tcMar>
+          </w:tcPr>
+          <w:p>
+            <w:pPr>
+              <w:spacing w:after="0"/>
+            </w:pPr>
+            <w:r>
+              <w:rPr>
+                <w:sz w:val="17"/>
+                <w:szCs w:val="17"/>
+              </w:rPr>
+              <w:t xml:space="preserve">PA</w:t>
+            </w:r>
+          </w:p>
+        </w:tc>
+        <w:tc>
+          <w:tcPr>
+            <w:tcW w:type="dxa" w:w="1000"/>
+            <w:tcMar>
+              <w:top w:type="dxa" w:w="40"/>
+              <w:left w:type="dxa" w:w="90"/>
+              <w:bottom w:type="dxa" w:w="40"/>
+              <w:right w:type="dxa" w:w="90"/>
+            </w:tcMar>
+          </w:tcPr>
+          <w:p>
+            <w:pPr>
+              <w:spacing w:after="0"/>
+            </w:pPr>
+            <w:r>
+              <w:rPr>
+                <w:sz w:val="17"/>
+                <w:szCs w:val="17"/>
+              </w:rPr>
+              <w:t xml:space="preserve">1,175</w:t>
+            </w:r>
+          </w:p>
+        </w:tc>
+        <w:tc>
+          <w:tcPr>
+            <w:tcW w:type="dxa" w:w="1100"/>
+            <w:tcMar>
+              <w:top w:type="dxa" w:w="40"/>
+              <w:left w:type="dxa" w:w="90"/>
+              <w:bottom w:type="dxa" w:w="40"/>
+              <w:right w:type="dxa" w:w="90"/>
+            </w:tcMar>
+          </w:tcPr>
+          <w:p>
+            <w:pPr>
+              <w:spacing w:after="0"/>
+            </w:pPr>
+            <w:r>
+              <w:rPr>
+                <w:sz w:val="17"/>
+                <w:szCs w:val="17"/>
+              </w:rPr>
+              <w:t xml:space="preserve">9</w:t>
+            </w:r>
+          </w:p>
+        </w:tc>
+        <w:tc>
+          <w:tcPr>
+            <w:tcW w:type="dxa" w:w="1100"/>
+            <w:tcMar>
+              <w:top w:type="dxa" w:w="40"/>
+              <w:left w:type="dxa" w:w="90"/>
+              <w:bottom w:type="dxa" w:w="40"/>
+              <w:right w:type="dxa" w:w="90"/>
+            </w:tcMar>
+          </w:tcPr>
+          <w:p>
+            <w:pPr>
+              <w:spacing w:after="0"/>
+            </w:pPr>
+            <w:r>
+              <w:rPr>
+                <w:sz w:val="17"/>
+                <w:szCs w:val="17"/>
+              </w:rPr>
+              <w:t xml:space="preserve">9</w:t>
+            </w:r>
+          </w:p>
+        </w:tc>
+      </w:tr>
+      <w:tr>
+        <w:tc>
+          <w:tcPr>
+            <w:tcW w:type="dxa" w:w="450"/>
+            <w:tcMar>
+              <w:top w:type="dxa" w:w="40"/>
+              <w:left w:type="dxa" w:w="90"/>
+              <w:bottom w:type="dxa" w:w="40"/>
+              <w:right w:type="dxa" w:w="90"/>
+            </w:tcMar>
+          </w:tcPr>
+          <w:p>
+            <w:pPr>
+              <w:spacing w:after="0"/>
+            </w:pPr>
+            <w:r>
+              <w:rPr>
+                <w:sz w:val="17"/>
+                <w:szCs w:val="17"/>
+              </w:rPr>
+              <w:t xml:space="preserve">3</w:t>
+            </w:r>
+          </w:p>
+        </w:tc>
+        <w:tc>
+          <w:tcPr>
+            <w:tcW w:type="dxa" w:w="2500"/>
+            <w:tcMar>
+              <w:top w:type="dxa" w:w="40"/>
+              <w:left w:type="dxa" w:w="90"/>
+              <w:bottom w:type="dxa" w:w="40"/>
+              <w:right w:type="dxa" w:w="90"/>
+            </w:tcMar>
+          </w:tcPr>
+          <w:p>
+            <w:pPr>
+              <w:spacing w:after="0"/>
+            </w:pPr>
+            <w:r>
+              <w:rPr>
+                <w:sz w:val="17"/>
+                <w:szCs w:val="17"/>
+              </w:rPr>
+              <w:t xml:space="preserve">Monte Alegre</w:t>
+            </w:r>
+          </w:p>
+        </w:tc>
+        <w:tc>
+          <w:tcPr>
+            <w:tcW w:type="dxa" w:w="550"/>
+            <w:tcMar>
+              <w:top w:type="dxa" w:w="40"/>
+              <w:left w:type="dxa" w:w="90"/>
+              <w:bottom w:type="dxa" w:w="40"/>
+              <w:right w:type="dxa" w:w="90"/>
+            </w:tcMar>
+          </w:tcPr>
+          <w:p>
+            <w:pPr>
+              <w:spacing w:after="0"/>
+            </w:pPr>
+            <w:r>
+              <w:rPr>
+                <w:sz w:val="17"/>
+                <w:szCs w:val="17"/>
+              </w:rPr>
+              <w:t xml:space="preserve">PA</w:t>
+            </w:r>
+          </w:p>
+        </w:tc>
+        <w:tc>
+          <w:tcPr>
+            <w:tcW w:type="dxa" w:w="1000"/>
+            <w:tcMar>
+              <w:top w:type="dxa" w:w="40"/>
+              <w:left w:type="dxa" w:w="90"/>
+              <w:bottom w:type="dxa" w:w="40"/>
+              <w:right w:type="dxa" w:w="90"/>
+            </w:tcMar>
+          </w:tcPr>
+          <w:p>
+            <w:pPr>
+              <w:spacing w:after="0"/>
+            </w:pPr>
+            <w:r>
+              <w:rPr>
+                <w:sz w:val="17"/>
+                <w:szCs w:val="17"/>
+              </w:rPr>
+              <w:t xml:space="preserve">1,109</w:t>
+            </w:r>
+          </w:p>
+        </w:tc>
+        <w:tc>
+          <w:tcPr>
+            <w:tcW w:type="dxa" w:w="1100"/>
+            <w:tcMar>
+              <w:top w:type="dxa" w:w="40"/>
+              <w:left w:type="dxa" w:w="90"/>
+              <w:bottom w:type="dxa" w:w="40"/>
+              <w:right w:type="dxa" w:w="90"/>
+            </w:tcMar>
+          </w:tcPr>
+          <w:p>
+            <w:pPr>
+              <w:spacing w:after="0"/>
+            </w:pPr>
+            <w:r>
+              <w:rPr>
+                <w:sz w:val="17"/>
+                <w:szCs w:val="17"/>
+              </w:rPr>
+              <w:t xml:space="preserve">11</w:t>
+            </w:r>
+          </w:p>
+        </w:tc>
+        <w:tc>
+          <w:tcPr>
+            <w:tcW w:type="dxa" w:w="1100"/>
+            <w:tcMar>
+              <w:top w:type="dxa" w:w="40"/>
+              <w:left w:type="dxa" w:w="90"/>
+              <w:bottom w:type="dxa" w:w="40"/>
+              <w:right w:type="dxa" w:w="90"/>
+            </w:tcMar>
+          </w:tcPr>
+          <w:p>
+            <w:pPr>
+              <w:spacing w:after="0"/>
+            </w:pPr>
+            <w:r>
+              <w:rPr>
+                <w:sz w:val="17"/>
+                <w:szCs w:val="17"/>
+              </w:rPr>
+              <w:t xml:space="preserve">7</w:t>
+            </w:r>
+          </w:p>
+        </w:tc>
+      </w:tr>
+      <w:tr>
+        <w:tc>
+          <w:tcPr>
+            <w:tcW w:type="dxa" w:w="450"/>
+            <w:tcMar>
+              <w:top w:type="dxa" w:w="40"/>
+              <w:left w:type="dxa" w:w="90"/>
+              <w:bottom w:type="dxa" w:w="40"/>
+              <w:right w:type="dxa" w:w="90"/>
+            </w:tcMar>
+          </w:tcPr>
+          <w:p>
+            <w:pPr>
+              <w:spacing w:after="0"/>
+            </w:pPr>
+            <w:r>
+              <w:rPr>
+                <w:sz w:val="17"/>
+                <w:szCs w:val="17"/>
+              </w:rPr>
+              <w:t xml:space="preserve">4</w:t>
+            </w:r>
+          </w:p>
+        </w:tc>
+        <w:tc>
+          <w:tcPr>
+            <w:tcW w:type="dxa" w:w="2500"/>
+            <w:tcMar>
+              <w:top w:type="dxa" w:w="40"/>
+              <w:left w:type="dxa" w:w="90"/>
+              <w:bottom w:type="dxa" w:w="40"/>
+              <w:right w:type="dxa" w:w="90"/>
+            </w:tcMar>
+          </w:tcPr>
+          <w:p>
+            <w:pPr>
+              <w:spacing w:after="0"/>
+            </w:pPr>
+            <w:r>
+              <w:rPr>
+                <w:sz w:val="17"/>
+                <w:szCs w:val="17"/>
+              </w:rPr>
+              <w:t xml:space="preserve">Aveiro</w:t>
+            </w:r>
+          </w:p>
+        </w:tc>
+        <w:tc>
+          <w:tcPr>
+            <w:tcW w:type="dxa" w:w="550"/>
+            <w:tcMar>
+              <w:top w:type="dxa" w:w="40"/>
+              <w:left w:type="dxa" w:w="90"/>
+              <w:bottom w:type="dxa" w:w="40"/>
+              <w:right w:type="dxa" w:w="90"/>
+            </w:tcMar>
+          </w:tcPr>
+          <w:p>
+            <w:pPr>
+              <w:spacing w:after="0"/>
+            </w:pPr>
+            <w:r>
+              <w:rPr>
+                <w:sz w:val="17"/>
+                <w:szCs w:val="17"/>
+              </w:rPr>
+              <w:t xml:space="preserve">PA</w:t>
+            </w:r>
+          </w:p>
+        </w:tc>
+        <w:tc>
+          <w:tcPr>
+            <w:tcW w:type="dxa" w:w="1000"/>
+            <w:tcMar>
+              <w:top w:type="dxa" w:w="40"/>
+              <w:left w:type="dxa" w:w="90"/>
+              <w:bottom w:type="dxa" w:w="40"/>
+              <w:right w:type="dxa" w:w="90"/>
+            </w:tcMar>
+          </w:tcPr>
+          <w:p>
+            <w:pPr>
+              <w:spacing w:after="0"/>
+            </w:pPr>
+            <w:r>
+              <w:rPr>
+                <w:sz w:val="17"/>
+                <w:szCs w:val="17"/>
+              </w:rPr>
+              <w:t xml:space="preserve">1,109</w:t>
+            </w:r>
+          </w:p>
+        </w:tc>
+        <w:tc>
+          <w:tcPr>
+            <w:tcW w:type="dxa" w:w="1100"/>
+            <w:tcMar>
+              <w:top w:type="dxa" w:w="40"/>
+              <w:left w:type="dxa" w:w="90"/>
+              <w:bottom w:type="dxa" w:w="40"/>
+              <w:right w:type="dxa" w:w="90"/>
+            </w:tcMar>
+          </w:tcPr>
+          <w:p>
+            <w:pPr>
+              <w:spacing w:after="0"/>
+            </w:pPr>
+            <w:r>
+              <w:rPr>
+                <w:sz w:val="17"/>
+                <w:szCs w:val="17"/>
+              </w:rPr>
+              <w:t xml:space="preserve">8</w:t>
+            </w:r>
+          </w:p>
+        </w:tc>
+        <w:tc>
+          <w:tcPr>
+            <w:tcW w:type="dxa" w:w="1100"/>
+            <w:tcMar>
+              <w:top w:type="dxa" w:w="40"/>
+              <w:left w:type="dxa" w:w="90"/>
+              <w:bottom w:type="dxa" w:w="40"/>
+              <w:right w:type="dxa" w:w="90"/>
+            </w:tcMar>
+          </w:tcPr>
+          <w:p>
+            <w:pPr>
+              <w:spacing w:after="0"/>
+            </w:pPr>
+            <w:r>
+              <w:rPr>
+                <w:sz w:val="17"/>
+                <w:szCs w:val="17"/>
+              </w:rPr>
+              <w:t xml:space="preserve">10</w:t>
+            </w:r>
+          </w:p>
+        </w:tc>
+      </w:tr>
+      <w:tr>
+        <w:tc>
+          <w:tcPr>
+            <w:tcW w:type="dxa" w:w="450"/>
+            <w:tcMar>
+              <w:top w:type="dxa" w:w="40"/>
+              <w:left w:type="dxa" w:w="90"/>
+              <w:bottom w:type="dxa" w:w="40"/>
+              <w:right w:type="dxa" w:w="90"/>
+            </w:tcMar>
+          </w:tcPr>
+          <w:p>
+            <w:pPr>
+              <w:spacing w:after="0"/>
+            </w:pPr>
+            <w:r>
+              <w:rPr>
+                <w:sz w:val="17"/>
+                <w:szCs w:val="17"/>
+              </w:rPr>
+              <w:t xml:space="preserve">5</w:t>
+            </w:r>
+          </w:p>
+        </w:tc>
+        <w:tc>
+          <w:tcPr>
+            <w:tcW w:type="dxa" w:w="2500"/>
+            <w:tcMar>
+              <w:top w:type="dxa" w:w="40"/>
+              <w:left w:type="dxa" w:w="90"/>
+              <w:bottom w:type="dxa" w:w="40"/>
+              <w:right w:type="dxa" w:w="90"/>
+            </w:tcMar>
+          </w:tcPr>
+          <w:p>
+            <w:pPr>
+              <w:spacing w:after="0"/>
+            </w:pPr>
+            <w:r>
+              <w:rPr>
+                <w:sz w:val="17"/>
+                <w:szCs w:val="17"/>
+              </w:rPr>
+              <w:t xml:space="preserve">Alenquer</w:t>
+            </w:r>
+          </w:p>
+        </w:tc>
+        <w:tc>
+          <w:tcPr>
+            <w:tcW w:type="dxa" w:w="550"/>
+            <w:tcMar>
+              <w:top w:type="dxa" w:w="40"/>
+              <w:left w:type="dxa" w:w="90"/>
+              <w:bottom w:type="dxa" w:w="40"/>
+              <w:right w:type="dxa" w:w="90"/>
+            </w:tcMar>
+          </w:tcPr>
+          <w:p>
+            <w:pPr>
+              <w:spacing w:after="0"/>
+            </w:pPr>
+            <w:r>
+              <w:rPr>
+                <w:sz w:val="17"/>
+                <w:szCs w:val="17"/>
+              </w:rPr>
+              <w:t xml:space="preserve">PA</w:t>
+            </w:r>
+          </w:p>
+        </w:tc>
+        <w:tc>
+          <w:tcPr>
+            <w:tcW w:type="dxa" w:w="1000"/>
+            <w:tcMar>
+              <w:top w:type="dxa" w:w="40"/>
+              <w:left w:type="dxa" w:w="90"/>
+              <w:bottom w:type="dxa" w:w="40"/>
+              <w:right w:type="dxa" w:w="90"/>
+            </w:tcMar>
+          </w:tcPr>
+          <w:p>
+            <w:pPr>
+              <w:spacing w:after="0"/>
+            </w:pPr>
+            <w:r>
+              <w:rPr>
+                <w:sz w:val="17"/>
+                <w:szCs w:val="17"/>
+              </w:rPr>
+              <w:t xml:space="preserve">1,107</w:t>
+            </w:r>
+          </w:p>
+        </w:tc>
+        <w:tc>
+          <w:tcPr>
+            <w:tcW w:type="dxa" w:w="1100"/>
+            <w:tcMar>
+              <w:top w:type="dxa" w:w="40"/>
+              <w:left w:type="dxa" w:w="90"/>
+              <w:bottom w:type="dxa" w:w="40"/>
+              <w:right w:type="dxa" w:w="90"/>
+            </w:tcMar>
+          </w:tcPr>
+          <w:p>
+            <w:pPr>
+              <w:spacing w:after="0"/>
+            </w:pPr>
+            <w:r>
+              <w:rPr>
+                <w:sz w:val="17"/>
+                <w:szCs w:val="17"/>
+              </w:rPr>
+              <w:t xml:space="preserve">9</w:t>
+            </w:r>
+          </w:p>
+        </w:tc>
+        <w:tc>
+          <w:tcPr>
+            <w:tcW w:type="dxa" w:w="1100"/>
+            <w:tcMar>
+              <w:top w:type="dxa" w:w="40"/>
+              <w:left w:type="dxa" w:w="90"/>
+              <w:bottom w:type="dxa" w:w="40"/>
+              <w:right w:type="dxa" w:w="90"/>
+            </w:tcMar>
+          </w:tcPr>
+          <w:p>
+            <w:pPr>
+              <w:spacing w:after="0"/>
+            </w:pPr>
+            <w:r>
+              <w:rPr>
+                <w:sz w:val="17"/>
+                <w:szCs w:val="17"/>
+              </w:rPr>
+              <w:t xml:space="preserve">9</w:t>
+            </w:r>
+          </w:p>
+        </w:tc>
+      </w:tr>
+      <w:tr>
+        <w:tc>
+          <w:tcPr>
+            <w:tcW w:type="dxa" w:w="450"/>
+            <w:tcMar>
+              <w:top w:type="dxa" w:w="40"/>
+              <w:left w:type="dxa" w:w="90"/>
+              <w:bottom w:type="dxa" w:w="40"/>
+              <w:right w:type="dxa" w:w="90"/>
+            </w:tcMar>
+          </w:tcPr>
+          <w:p>
+            <w:pPr>
+              <w:spacing w:after="0"/>
+            </w:pPr>
+            <w:r>
+              <w:rPr>
+                <w:sz w:val="17"/>
+                <w:szCs w:val="17"/>
+              </w:rPr>
+              <w:t xml:space="preserve">6</w:t>
+            </w:r>
+          </w:p>
+        </w:tc>
+        <w:tc>
+          <w:tcPr>
+            <w:tcW w:type="dxa" w:w="2500"/>
+            <w:tcMar>
+              <w:top w:type="dxa" w:w="40"/>
+              <w:left w:type="dxa" w:w="90"/>
+              <w:bottom w:type="dxa" w:w="40"/>
+              <w:right w:type="dxa" w:w="90"/>
+            </w:tcMar>
+          </w:tcPr>
+          <w:p>
+            <w:pPr>
+              <w:spacing w:after="0"/>
+            </w:pPr>
+            <w:r>
+              <w:rPr>
+                <w:sz w:val="17"/>
+                <w:szCs w:val="17"/>
+              </w:rPr>
+              <w:t xml:space="preserve">Arame</w:t>
+            </w:r>
+          </w:p>
+        </w:tc>
+        <w:tc>
+          <w:tcPr>
+            <w:tcW w:type="dxa" w:w="550"/>
+            <w:tcMar>
+              <w:top w:type="dxa" w:w="40"/>
+              <w:left w:type="dxa" w:w="90"/>
+              <w:bottom w:type="dxa" w:w="40"/>
+              <w:right w:type="dxa" w:w="90"/>
+            </w:tcMar>
+          </w:tcPr>
+          <w:p>
+            <w:pPr>
+              <w:spacing w:after="0"/>
+            </w:pPr>
+            <w:r>
+              <w:rPr>
+                <w:sz w:val="17"/>
+                <w:szCs w:val="17"/>
+              </w:rPr>
+              <w:t xml:space="preserve">MA</w:t>
+            </w:r>
+          </w:p>
+        </w:tc>
+        <w:tc>
+          <w:tcPr>
+            <w:tcW w:type="dxa" w:w="1000"/>
+            <w:tcMar>
+              <w:top w:type="dxa" w:w="40"/>
+              <w:left w:type="dxa" w:w="90"/>
+              <w:bottom w:type="dxa" w:w="40"/>
+              <w:right w:type="dxa" w:w="90"/>
+            </w:tcMar>
+          </w:tcPr>
+          <w:p>
+            <w:pPr>
+              <w:spacing w:after="0"/>
+            </w:pPr>
+            <w:r>
+              <w:rPr>
+                <w:sz w:val="17"/>
+                <w:szCs w:val="17"/>
+              </w:rPr>
+              <w:t xml:space="preserve">1,078</w:t>
+            </w:r>
+          </w:p>
+        </w:tc>
+        <w:tc>
+          <w:tcPr>
+            <w:tcW w:type="dxa" w:w="1100"/>
+            <w:tcMar>
+              <w:top w:type="dxa" w:w="40"/>
+              <w:left w:type="dxa" w:w="90"/>
+              <w:bottom w:type="dxa" w:w="40"/>
+              <w:right w:type="dxa" w:w="90"/>
+            </w:tcMar>
+          </w:tcPr>
+          <w:p>
+            <w:pPr>
+              <w:spacing w:after="0"/>
+            </w:pPr>
+            <w:r>
+              <w:rPr>
+                <w:sz w:val="17"/>
+                <w:szCs w:val="17"/>
+              </w:rPr>
+              <w:t xml:space="preserve">11</w:t>
+            </w:r>
+          </w:p>
+        </w:tc>
+        <w:tc>
+          <w:tcPr>
+            <w:tcW w:type="dxa" w:w="1100"/>
+            <w:tcMar>
+              <w:top w:type="dxa" w:w="40"/>
+              <w:left w:type="dxa" w:w="90"/>
+              <w:bottom w:type="dxa" w:w="40"/>
+              <w:right w:type="dxa" w:w="90"/>
+            </w:tcMar>
+          </w:tcPr>
+          <w:p>
+            <w:pPr>
+              <w:spacing w:after="0"/>
+            </w:pPr>
+            <w:r>
+              <w:rPr>
+                <w:sz w:val="17"/>
+                <w:szCs w:val="17"/>
+              </w:rPr>
+              <w:t xml:space="preserve">7</w:t>
+            </w:r>
+          </w:p>
+        </w:tc>
+      </w:tr>
+      <w:tr>
+        <w:tc>
+          <w:tcPr>
+            <w:tcW w:type="dxa" w:w="450"/>
+            <w:tcMar>
+              <w:top w:type="dxa" w:w="40"/>
+              <w:left w:type="dxa" w:w="90"/>
+              <w:bottom w:type="dxa" w:w="40"/>
+              <w:right w:type="dxa" w:w="90"/>
+            </w:tcMar>
+          </w:tcPr>
+          <w:p>
+            <w:pPr>
+              <w:spacing w:after="0"/>
+            </w:pPr>
+            <w:r>
+              <w:rPr>
+                <w:sz w:val="17"/>
+                <w:szCs w:val="17"/>
+              </w:rPr>
+              <w:t xml:space="preserve">7</w:t>
+            </w:r>
+          </w:p>
+        </w:tc>
+        <w:tc>
+          <w:tcPr>
+            <w:tcW w:type="dxa" w:w="2500"/>
+            <w:tcMar>
+              <w:top w:type="dxa" w:w="40"/>
+              <w:left w:type="dxa" w:w="90"/>
+              <w:bottom w:type="dxa" w:w="40"/>
+              <w:right w:type="dxa" w:w="90"/>
+            </w:tcMar>
+          </w:tcPr>
+          <w:p>
+            <w:pPr>
+              <w:spacing w:after="0"/>
+            </w:pPr>
+            <w:r>
+              <w:rPr>
+                <w:sz w:val="17"/>
+                <w:szCs w:val="17"/>
+              </w:rPr>
+              <w:t xml:space="preserve">Acará</w:t>
+            </w:r>
+          </w:p>
+        </w:tc>
+        <w:tc>
+          <w:tcPr>
+            <w:tcW w:type="dxa" w:w="550"/>
+            <w:tcMar>
+              <w:top w:type="dxa" w:w="40"/>
+              <w:left w:type="dxa" w:w="90"/>
+              <w:bottom w:type="dxa" w:w="40"/>
+              <w:right w:type="dxa" w:w="90"/>
+            </w:tcMar>
+          </w:tcPr>
+          <w:p>
+            <w:pPr>
+              <w:spacing w:after="0"/>
+            </w:pPr>
+            <w:r>
+              <w:rPr>
+                <w:sz w:val="17"/>
+                <w:szCs w:val="17"/>
+              </w:rPr>
+              <w:t xml:space="preserve">PA</w:t>
+            </w:r>
+          </w:p>
+        </w:tc>
+        <w:tc>
+          <w:tcPr>
+            <w:tcW w:type="dxa" w:w="1000"/>
+            <w:tcMar>
+              <w:top w:type="dxa" w:w="40"/>
+              <w:left w:type="dxa" w:w="90"/>
+              <w:bottom w:type="dxa" w:w="40"/>
+              <w:right w:type="dxa" w:w="90"/>
+            </w:tcMar>
+          </w:tcPr>
+          <w:p>
+            <w:pPr>
+              <w:spacing w:after="0"/>
+            </w:pPr>
+            <w:r>
+              <w:rPr>
+                <w:sz w:val="17"/>
+                <w:szCs w:val="17"/>
+              </w:rPr>
+              <w:t xml:space="preserve">1,075</w:t>
+            </w:r>
+          </w:p>
+        </w:tc>
+        <w:tc>
+          <w:tcPr>
+            <w:tcW w:type="dxa" w:w="1100"/>
+            <w:tcMar>
+              <w:top w:type="dxa" w:w="40"/>
+              <w:left w:type="dxa" w:w="90"/>
+              <w:bottom w:type="dxa" w:w="40"/>
+              <w:right w:type="dxa" w:w="90"/>
+            </w:tcMar>
+          </w:tcPr>
+          <w:p>
+            <w:pPr>
+              <w:spacing w:after="0"/>
+            </w:pPr>
+            <w:r>
+              <w:rPr>
+                <w:sz w:val="17"/>
+                <w:szCs w:val="17"/>
+              </w:rPr>
+              <w:t xml:space="preserve">13</w:t>
+            </w:r>
+          </w:p>
+        </w:tc>
+        <w:tc>
+          <w:tcPr>
+            <w:tcW w:type="dxa" w:w="1100"/>
+            <w:tcMar>
+              <w:top w:type="dxa" w:w="40"/>
+              <w:left w:type="dxa" w:w="90"/>
+              <w:bottom w:type="dxa" w:w="40"/>
+              <w:right w:type="dxa" w:w="90"/>
+            </w:tcMar>
+          </w:tcPr>
+          <w:p>
+            <w:pPr>
+              <w:spacing w:after="0"/>
+            </w:pPr>
+            <w:r>
+              <w:rPr>
+                <w:sz w:val="17"/>
+                <w:szCs w:val="17"/>
+              </w:rPr>
+              <w:t xml:space="preserve">5</w:t>
+            </w:r>
+          </w:p>
+        </w:tc>
+      </w:tr>
+      <w:tr>
+        <w:tc>
+          <w:tcPr>
+            <w:tcW w:type="dxa" w:w="450"/>
+            <w:tcMar>
+              <w:top w:type="dxa" w:w="40"/>
+              <w:left w:type="dxa" w:w="90"/>
+              <w:bottom w:type="dxa" w:w="40"/>
+              <w:right w:type="dxa" w:w="90"/>
+            </w:tcMar>
+          </w:tcPr>
+          <w:p>
+            <w:pPr>
+              <w:spacing w:after="0"/>
+            </w:pPr>
+            <w:r>
+              <w:rPr>
+                <w:sz w:val="17"/>
+                <w:szCs w:val="17"/>
+              </w:rPr>
+              <w:t xml:space="preserve">8</w:t>
+            </w:r>
+          </w:p>
+        </w:tc>
+        <w:tc>
+          <w:tcPr>
+            <w:tcW w:type="dxa" w:w="2500"/>
+            <w:tcMar>
+              <w:top w:type="dxa" w:w="40"/>
+              <w:left w:type="dxa" w:w="90"/>
+              <w:bottom w:type="dxa" w:w="40"/>
+              <w:right w:type="dxa" w:w="90"/>
+            </w:tcMar>
+          </w:tcPr>
+          <w:p>
+            <w:pPr>
+              <w:spacing w:after="0"/>
+            </w:pPr>
+            <w:r>
+              <w:rPr>
+                <w:sz w:val="17"/>
+                <w:szCs w:val="17"/>
+              </w:rPr>
+              <w:t xml:space="preserve">Mojuí dos Campos</w:t>
+            </w:r>
+          </w:p>
+        </w:tc>
+        <w:tc>
+          <w:tcPr>
+            <w:tcW w:type="dxa" w:w="550"/>
+            <w:tcMar>
+              <w:top w:type="dxa" w:w="40"/>
+              <w:left w:type="dxa" w:w="90"/>
+              <w:bottom w:type="dxa" w:w="40"/>
+              <w:right w:type="dxa" w:w="90"/>
+            </w:tcMar>
+          </w:tcPr>
+          <w:p>
+            <w:pPr>
+              <w:spacing w:after="0"/>
+            </w:pPr>
+            <w:r>
+              <w:rPr>
+                <w:sz w:val="17"/>
+                <w:szCs w:val="17"/>
+              </w:rPr>
+              <w:t xml:space="preserve">PA</w:t>
+            </w:r>
+          </w:p>
+        </w:tc>
+        <w:tc>
+          <w:tcPr>
+            <w:tcW w:type="dxa" w:w="1000"/>
+            <w:tcMar>
+              <w:top w:type="dxa" w:w="40"/>
+              <w:left w:type="dxa" w:w="90"/>
+              <w:bottom w:type="dxa" w:w="40"/>
+              <w:right w:type="dxa" w:w="90"/>
+            </w:tcMar>
+          </w:tcPr>
+          <w:p>
+            <w:pPr>
+              <w:spacing w:after="0"/>
+            </w:pPr>
+            <w:r>
+              <w:rPr>
+                <w:sz w:val="17"/>
+                <w:szCs w:val="17"/>
+              </w:rPr>
+              <w:t xml:space="preserve">1,068</w:t>
+            </w:r>
+          </w:p>
+        </w:tc>
+        <w:tc>
+          <w:tcPr>
+            <w:tcW w:type="dxa" w:w="1100"/>
+            <w:tcMar>
+              <w:top w:type="dxa" w:w="40"/>
+              <w:left w:type="dxa" w:w="90"/>
+              <w:bottom w:type="dxa" w:w="40"/>
+              <w:right w:type="dxa" w:w="90"/>
+            </w:tcMar>
+          </w:tcPr>
+          <w:p>
+            <w:pPr>
+              <w:spacing w:after="0"/>
+            </w:pPr>
+            <w:r>
+              <w:rPr>
+                <w:sz w:val="17"/>
+                <w:szCs w:val="17"/>
+              </w:rPr>
+              <w:t xml:space="preserve">11</w:t>
+            </w:r>
+          </w:p>
+        </w:tc>
+        <w:tc>
+          <w:tcPr>
+            <w:tcW w:type="dxa" w:w="1100"/>
+            <w:tcMar>
+              <w:top w:type="dxa" w:w="40"/>
+              <w:left w:type="dxa" w:w="90"/>
+              <w:bottom w:type="dxa" w:w="40"/>
+              <w:right w:type="dxa" w:w="90"/>
+            </w:tcMar>
+          </w:tcPr>
+          <w:p>
+            <w:pPr>
+              <w:spacing w:after="0"/>
+            </w:pPr>
+            <w:r>
+              <w:rPr>
+                <w:sz w:val="17"/>
+                <w:szCs w:val="17"/>
+              </w:rPr>
+              <w:t xml:space="preserve">7</w:t>
+            </w:r>
+          </w:p>
+        </w:tc>
+      </w:tr>
+      <w:tr>
+        <w:tc>
+          <w:tcPr>
+            <w:tcW w:type="dxa" w:w="450"/>
+            <w:tcMar>
+              <w:top w:type="dxa" w:w="40"/>
+              <w:left w:type="dxa" w:w="90"/>
+              <w:bottom w:type="dxa" w:w="40"/>
+              <w:right w:type="dxa" w:w="90"/>
+            </w:tcMar>
+          </w:tcPr>
+          <w:p>
+            <w:pPr>
+              <w:spacing w:after="0"/>
+            </w:pPr>
+            <w:r>
+              <w:rPr>
+                <w:sz w:val="17"/>
+                <w:szCs w:val="17"/>
+              </w:rPr>
+              <w:t xml:space="preserve">9</w:t>
+            </w:r>
+          </w:p>
+        </w:tc>
+        <w:tc>
+          <w:tcPr>
+            <w:tcW w:type="dxa" w:w="2500"/>
+            <w:tcMar>
+              <w:top w:type="dxa" w:w="40"/>
+              <w:left w:type="dxa" w:w="90"/>
+              <w:bottom w:type="dxa" w:w="40"/>
+              <w:right w:type="dxa" w:w="90"/>
+            </w:tcMar>
+          </w:tcPr>
+          <w:p>
+            <w:pPr>
+              <w:spacing w:after="0"/>
+            </w:pPr>
+            <w:r>
+              <w:rPr>
+                <w:sz w:val="17"/>
+                <w:szCs w:val="17"/>
+              </w:rPr>
+              <w:t xml:space="preserve">Maués</w:t>
+            </w:r>
+          </w:p>
+        </w:tc>
+        <w:tc>
+          <w:tcPr>
+            <w:tcW w:type="dxa" w:w="550"/>
+            <w:tcMar>
+              <w:top w:type="dxa" w:w="40"/>
+              <w:left w:type="dxa" w:w="90"/>
+              <w:bottom w:type="dxa" w:w="40"/>
+              <w:right w:type="dxa" w:w="90"/>
+            </w:tcMar>
+          </w:tcPr>
+          <w:p>
+            <w:pPr>
+              <w:spacing w:after="0"/>
+            </w:pPr>
+            <w:r>
+              <w:rPr>
+                <w:sz w:val="17"/>
+                <w:szCs w:val="17"/>
+              </w:rPr>
+              <w:t xml:space="preserve">AM</w:t>
+            </w:r>
+          </w:p>
+        </w:tc>
+        <w:tc>
+          <w:tcPr>
+            <w:tcW w:type="dxa" w:w="1000"/>
+            <w:tcMar>
+              <w:top w:type="dxa" w:w="40"/>
+              <w:left w:type="dxa" w:w="90"/>
+              <w:bottom w:type="dxa" w:w="40"/>
+              <w:right w:type="dxa" w:w="90"/>
+            </w:tcMar>
+          </w:tcPr>
+          <w:p>
+            <w:pPr>
+              <w:spacing w:after="0"/>
+            </w:pPr>
+            <w:r>
+              <w:rPr>
+                <w:sz w:val="17"/>
+                <w:szCs w:val="17"/>
+              </w:rPr>
+              <w:t xml:space="preserve">1,036</w:t>
+            </w:r>
+          </w:p>
+        </w:tc>
+        <w:tc>
+          <w:tcPr>
+            <w:tcW w:type="dxa" w:w="1100"/>
+            <w:tcMar>
+              <w:top w:type="dxa" w:w="40"/>
+              <w:left w:type="dxa" w:w="90"/>
+              <w:bottom w:type="dxa" w:w="40"/>
+              <w:right w:type="dxa" w:w="90"/>
+            </w:tcMar>
+          </w:tcPr>
+          <w:p>
+            <w:pPr>
+              <w:spacing w:after="0"/>
+            </w:pPr>
+            <w:r>
+              <w:rPr>
+                <w:sz w:val="17"/>
+                <w:szCs w:val="17"/>
+              </w:rPr>
+              <w:t xml:space="preserve">8</w:t>
+            </w:r>
+          </w:p>
+        </w:tc>
+        <w:tc>
+          <w:tcPr>
+            <w:tcW w:type="dxa" w:w="1100"/>
+            <w:tcMar>
+              <w:top w:type="dxa" w:w="40"/>
+              <w:left w:type="dxa" w:w="90"/>
+              <w:bottom w:type="dxa" w:w="40"/>
+              <w:right w:type="dxa" w:w="90"/>
+            </w:tcMar>
+          </w:tcPr>
+          <w:p>
+            <w:pPr>
+              <w:spacing w:after="0"/>
+            </w:pPr>
+            <w:r>
+              <w:rPr>
+                <w:sz w:val="17"/>
+                <w:szCs w:val="17"/>
+              </w:rPr>
+              <w:t xml:space="preserve">10</w:t>
+            </w:r>
+          </w:p>
+        </w:tc>
+      </w:tr>
+      <w:tr>
+        <w:tc>
+          <w:tcPr>
+            <w:tcW w:type="dxa" w:w="450"/>
+            <w:tcMar>
+              <w:top w:type="dxa" w:w="40"/>
+              <w:left w:type="dxa" w:w="90"/>
+              <w:bottom w:type="dxa" w:w="40"/>
+              <w:right w:type="dxa" w:w="90"/>
+            </w:tcMar>
+          </w:tcPr>
+          <w:p>
+            <w:pPr>
+              <w:spacing w:after="0"/>
+            </w:pPr>
+            <w:r>
+              <w:rPr>
+                <w:sz w:val="17"/>
+                <w:szCs w:val="17"/>
+              </w:rPr>
+              <w:t xml:space="preserve">10</w:t>
+            </w:r>
+          </w:p>
+        </w:tc>
+        <w:tc>
+          <w:tcPr>
+            <w:tcW w:type="dxa" w:w="2500"/>
+            <w:tcMar>
+              <w:top w:type="dxa" w:w="40"/>
+              <w:left w:type="dxa" w:w="90"/>
+              <w:bottom w:type="dxa" w:w="40"/>
+              <w:right w:type="dxa" w:w="90"/>
+            </w:tcMar>
+          </w:tcPr>
+          <w:p>
+            <w:pPr>
+              <w:spacing w:after="0"/>
+            </w:pPr>
+            <w:r>
+              <w:rPr>
+                <w:sz w:val="17"/>
+                <w:szCs w:val="17"/>
+              </w:rPr>
+              <w:t xml:space="preserve">Santa Maria das Barreiras</w:t>
+            </w:r>
+          </w:p>
+        </w:tc>
+        <w:tc>
+          <w:tcPr>
+            <w:tcW w:type="dxa" w:w="550"/>
+            <w:tcMar>
+              <w:top w:type="dxa" w:w="40"/>
+              <w:left w:type="dxa" w:w="90"/>
+              <w:bottom w:type="dxa" w:w="40"/>
+              <w:right w:type="dxa" w:w="90"/>
+            </w:tcMar>
+          </w:tcPr>
+          <w:p>
+            <w:pPr>
+              <w:spacing w:after="0"/>
+            </w:pPr>
+            <w:r>
+              <w:rPr>
+                <w:sz w:val="17"/>
+                <w:szCs w:val="17"/>
+              </w:rPr>
+              <w:t xml:space="preserve">PA</w:t>
+            </w:r>
+          </w:p>
+        </w:tc>
+        <w:tc>
+          <w:tcPr>
+            <w:tcW w:type="dxa" w:w="1000"/>
+            <w:tcMar>
+              <w:top w:type="dxa" w:w="40"/>
+              <w:left w:type="dxa" w:w="90"/>
+              <w:bottom w:type="dxa" w:w="40"/>
+              <w:right w:type="dxa" w:w="90"/>
+            </w:tcMar>
+          </w:tcPr>
+          <w:p>
+            <w:pPr>
+              <w:spacing w:after="0"/>
+            </w:pPr>
+            <w:r>
+              <w:rPr>
+                <w:sz w:val="17"/>
+                <w:szCs w:val="17"/>
+              </w:rPr>
+              <w:t xml:space="preserve">1,021</w:t>
+            </w:r>
+          </w:p>
+        </w:tc>
+        <w:tc>
+          <w:tcPr>
+            <w:tcW w:type="dxa" w:w="1100"/>
+            <w:tcMar>
+              <w:top w:type="dxa" w:w="40"/>
+              <w:left w:type="dxa" w:w="90"/>
+              <w:bottom w:type="dxa" w:w="40"/>
+              <w:right w:type="dxa" w:w="90"/>
+            </w:tcMar>
+          </w:tcPr>
+          <w:p>
+            <w:pPr>
+              <w:spacing w:after="0"/>
+            </w:pPr>
+            <w:r>
+              <w:rPr>
+                <w:sz w:val="17"/>
+                <w:szCs w:val="17"/>
+              </w:rPr>
+              <w:t xml:space="preserve">11</w:t>
+            </w:r>
+          </w:p>
+        </w:tc>
+        <w:tc>
+          <w:tcPr>
+            <w:tcW w:type="dxa" w:w="1100"/>
+            <w:tcMar>
+              <w:top w:type="dxa" w:w="40"/>
+              <w:left w:type="dxa" w:w="90"/>
+              <w:bottom w:type="dxa" w:w="40"/>
+              <w:right w:type="dxa" w:w="90"/>
+            </w:tcMar>
+          </w:tcPr>
+          <w:p>
+            <w:pPr>
+              <w:spacing w:after="0"/>
+            </w:pPr>
+            <w:r>
+              <w:rPr>
+                <w:sz w:val="17"/>
+                <w:szCs w:val="17"/>
+              </w:rPr>
+              <w:t xml:space="preserve">7</w:t>
+            </w:r>
+          </w:p>
+        </w:tc>
+      </w:tr>
+      <w:tr>
+        <w:tc>
+          <w:tcPr>
+            <w:tcW w:type="dxa" w:w="450"/>
+            <w:tcMar>
+              <w:top w:type="dxa" w:w="40"/>
+              <w:left w:type="dxa" w:w="90"/>
+              <w:bottom w:type="dxa" w:w="40"/>
+              <w:right w:type="dxa" w:w="90"/>
+            </w:tcMar>
+          </w:tcPr>
+          <w:p>
+            <w:pPr>
+              <w:spacing w:after="0"/>
+            </w:pPr>
+            <w:r>
+              <w:rPr>
+                <w:sz w:val="17"/>
+                <w:szCs w:val="17"/>
+              </w:rPr>
+              <w:t xml:space="preserve">11</w:t>
+            </w:r>
+          </w:p>
+        </w:tc>
+        <w:tc>
+          <w:tcPr>
+            <w:tcW w:type="dxa" w:w="2500"/>
+            <w:tcMar>
+              <w:top w:type="dxa" w:w="40"/>
+              <w:left w:type="dxa" w:w="90"/>
+              <w:bottom w:type="dxa" w:w="40"/>
+              <w:right w:type="dxa" w:w="90"/>
+            </w:tcMar>
+          </w:tcPr>
+          <w:p>
+            <w:pPr>
+              <w:spacing w:after="0"/>
+            </w:pPr>
+            <w:r>
+              <w:rPr>
+                <w:sz w:val="17"/>
+                <w:szCs w:val="17"/>
+              </w:rPr>
+              <w:t xml:space="preserve">Itupiranga</w:t>
+            </w:r>
+          </w:p>
+        </w:tc>
+        <w:tc>
+          <w:tcPr>
+            <w:tcW w:type="dxa" w:w="550"/>
+            <w:tcMar>
+              <w:top w:type="dxa" w:w="40"/>
+              <w:left w:type="dxa" w:w="90"/>
+              <w:bottom w:type="dxa" w:w="40"/>
+              <w:right w:type="dxa" w:w="90"/>
+            </w:tcMar>
+          </w:tcPr>
+          <w:p>
+            <w:pPr>
+              <w:spacing w:after="0"/>
+            </w:pPr>
+            <w:r>
+              <w:rPr>
+                <w:sz w:val="17"/>
+                <w:szCs w:val="17"/>
+              </w:rPr>
+              <w:t xml:space="preserve">PA</w:t>
+            </w:r>
+          </w:p>
+        </w:tc>
+        <w:tc>
+          <w:tcPr>
+            <w:tcW w:type="dxa" w:w="1000"/>
+            <w:tcMar>
+              <w:top w:type="dxa" w:w="40"/>
+              <w:left w:type="dxa" w:w="90"/>
+              <w:bottom w:type="dxa" w:w="40"/>
+              <w:right w:type="dxa" w:w="90"/>
+            </w:tcMar>
+          </w:tcPr>
+          <w:p>
+            <w:pPr>
+              <w:spacing w:after="0"/>
+            </w:pPr>
+            <w:r>
+              <w:rPr>
+                <w:sz w:val="17"/>
+                <w:szCs w:val="17"/>
+              </w:rPr>
+              <w:t xml:space="preserve">1,015</w:t>
+            </w:r>
+          </w:p>
+        </w:tc>
+        <w:tc>
+          <w:tcPr>
+            <w:tcW w:type="dxa" w:w="1100"/>
+            <w:tcMar>
+              <w:top w:type="dxa" w:w="40"/>
+              <w:left w:type="dxa" w:w="90"/>
+              <w:bottom w:type="dxa" w:w="40"/>
+              <w:right w:type="dxa" w:w="90"/>
+            </w:tcMar>
+          </w:tcPr>
+          <w:p>
+            <w:pPr>
+              <w:spacing w:after="0"/>
+            </w:pPr>
+            <w:r>
+              <w:rPr>
+                <w:sz w:val="17"/>
+                <w:szCs w:val="17"/>
+              </w:rPr>
+              <w:t xml:space="preserve">5</w:t>
+            </w:r>
+          </w:p>
+        </w:tc>
+        <w:tc>
+          <w:tcPr>
+            <w:tcW w:type="dxa" w:w="1100"/>
+            <w:tcMar>
+              <w:top w:type="dxa" w:w="40"/>
+              <w:left w:type="dxa" w:w="90"/>
+              <w:bottom w:type="dxa" w:w="40"/>
+              <w:right w:type="dxa" w:w="90"/>
+            </w:tcMar>
+          </w:tcPr>
+          <w:p>
+            <w:pPr>
+              <w:spacing w:after="0"/>
+            </w:pPr>
+            <w:r>
+              <w:rPr>
+                <w:sz w:val="17"/>
+                <w:szCs w:val="17"/>
+              </w:rPr>
+              <w:t xml:space="preserve">13</w:t>
+            </w:r>
+          </w:p>
+        </w:tc>
+      </w:tr>
+      <w:tr>
+        <w:tc>
+          <w:tcPr>
+            <w:tcW w:type="dxa" w:w="450"/>
+            <w:tcMar>
+              <w:top w:type="dxa" w:w="40"/>
+              <w:left w:type="dxa" w:w="90"/>
+              <w:bottom w:type="dxa" w:w="40"/>
+              <w:right w:type="dxa" w:w="90"/>
+            </w:tcMar>
+          </w:tcPr>
+          <w:p>
+            <w:pPr>
+              <w:spacing w:after="0"/>
+            </w:pPr>
+            <w:r>
+              <w:rPr>
+                <w:sz w:val="17"/>
+                <w:szCs w:val="17"/>
+              </w:rPr>
+              <w:t xml:space="preserve">12</w:t>
+            </w:r>
+          </w:p>
+        </w:tc>
+        <w:tc>
+          <w:tcPr>
+            <w:tcW w:type="dxa" w:w="2500"/>
+            <w:tcMar>
+              <w:top w:type="dxa" w:w="40"/>
+              <w:left w:type="dxa" w:w="90"/>
+              <w:bottom w:type="dxa" w:w="40"/>
+              <w:right w:type="dxa" w:w="90"/>
+            </w:tcMar>
+          </w:tcPr>
+          <w:p>
+            <w:pPr>
+              <w:spacing w:after="0"/>
+            </w:pPr>
+            <w:r>
+              <w:rPr>
+                <w:sz w:val="17"/>
+                <w:szCs w:val="17"/>
+              </w:rPr>
+              <w:t xml:space="preserve">Cumaru do Norte</w:t>
+            </w:r>
+          </w:p>
+        </w:tc>
+        <w:tc>
+          <w:tcPr>
+            <w:tcW w:type="dxa" w:w="550"/>
+            <w:tcMar>
+              <w:top w:type="dxa" w:w="40"/>
+              <w:left w:type="dxa" w:w="90"/>
+              <w:bottom w:type="dxa" w:w="40"/>
+              <w:right w:type="dxa" w:w="90"/>
+            </w:tcMar>
+          </w:tcPr>
+          <w:p>
+            <w:pPr>
+              <w:spacing w:after="0"/>
+            </w:pPr>
+            <w:r>
+              <w:rPr>
+                <w:sz w:val="17"/>
+                <w:szCs w:val="17"/>
+              </w:rPr>
+              <w:t xml:space="preserve">PA</w:t>
+            </w:r>
+          </w:p>
+        </w:tc>
+        <w:tc>
+          <w:tcPr>
+            <w:tcW w:type="dxa" w:w="1000"/>
+            <w:tcMar>
+              <w:top w:type="dxa" w:w="40"/>
+              <w:left w:type="dxa" w:w="90"/>
+              <w:bottom w:type="dxa" w:w="40"/>
+              <w:right w:type="dxa" w:w="90"/>
+            </w:tcMar>
+          </w:tcPr>
+          <w:p>
+            <w:pPr>
+              <w:spacing w:after="0"/>
+            </w:pPr>
+            <w:r>
+              <w:rPr>
+                <w:sz w:val="17"/>
+                <w:szCs w:val="17"/>
+              </w:rPr>
+              <w:t xml:space="preserve">1,000</w:t>
+            </w:r>
+          </w:p>
+        </w:tc>
+        <w:tc>
+          <w:tcPr>
+            <w:tcW w:type="dxa" w:w="1100"/>
+            <w:tcMar>
+              <w:top w:type="dxa" w:w="40"/>
+              <w:left w:type="dxa" w:w="90"/>
+              <w:bottom w:type="dxa" w:w="40"/>
+              <w:right w:type="dxa" w:w="90"/>
+            </w:tcMar>
+          </w:tcPr>
+          <w:p>
+            <w:pPr>
+              <w:spacing w:after="0"/>
+            </w:pPr>
+            <w:r>
+              <w:rPr>
+                <w:sz w:val="17"/>
+                <w:szCs w:val="17"/>
+              </w:rPr>
+              <w:t xml:space="preserve">6</w:t>
+            </w:r>
+          </w:p>
+        </w:tc>
+        <w:tc>
+          <w:tcPr>
+            <w:tcW w:type="dxa" w:w="1100"/>
+            <w:tcMar>
+              <w:top w:type="dxa" w:w="40"/>
+              <w:left w:type="dxa" w:w="90"/>
+              <w:bottom w:type="dxa" w:w="40"/>
+              <w:right w:type="dxa" w:w="90"/>
+            </w:tcMar>
+          </w:tcPr>
+          <w:p>
+            <w:pPr>
+              <w:spacing w:after="0"/>
+            </w:pPr>
+            <w:r>
+              <w:rPr>
+                <w:sz w:val="17"/>
+                <w:szCs w:val="17"/>
+              </w:rPr>
+              <w:t xml:space="preserve">12</w:t>
+            </w:r>
+          </w:p>
+        </w:tc>
+      </w:tr>
+      <w:tr>
+        <w:tc>
+          <w:tcPr>
+            <w:tcW w:type="dxa" w:w="450"/>
+            <w:tcMar>
+              <w:top w:type="dxa" w:w="40"/>
+              <w:left w:type="dxa" w:w="90"/>
+              <w:bottom w:type="dxa" w:w="40"/>
+              <w:right w:type="dxa" w:w="90"/>
+            </w:tcMar>
+          </w:tcPr>
+          <w:p>
+            <w:pPr>
+              <w:spacing w:after="0"/>
+            </w:pPr>
+            <w:r>
+              <w:rPr>
+                <w:sz w:val="17"/>
+                <w:szCs w:val="17"/>
+              </w:rPr>
+              <w:t xml:space="preserve">13</w:t>
+            </w:r>
+          </w:p>
+        </w:tc>
+        <w:tc>
+          <w:tcPr>
+            <w:tcW w:type="dxa" w:w="2500"/>
+            <w:tcMar>
+              <w:top w:type="dxa" w:w="40"/>
+              <w:left w:type="dxa" w:w="90"/>
+              <w:bottom w:type="dxa" w:w="40"/>
+              <w:right w:type="dxa" w:w="90"/>
+            </w:tcMar>
+          </w:tcPr>
+          <w:p>
+            <w:pPr>
+              <w:spacing w:after="0"/>
+            </w:pPr>
+            <w:r>
+              <w:rPr>
+                <w:sz w:val="17"/>
+                <w:szCs w:val="17"/>
+              </w:rPr>
+              <w:t xml:space="preserve">Jacareacanga</w:t>
+            </w:r>
+          </w:p>
+        </w:tc>
+        <w:tc>
+          <w:tcPr>
+            <w:tcW w:type="dxa" w:w="550"/>
+            <w:tcMar>
+              <w:top w:type="dxa" w:w="40"/>
+              <w:left w:type="dxa" w:w="90"/>
+              <w:bottom w:type="dxa" w:w="40"/>
+              <w:right w:type="dxa" w:w="90"/>
+            </w:tcMar>
+          </w:tcPr>
+          <w:p>
+            <w:pPr>
+              <w:spacing w:after="0"/>
+            </w:pPr>
+            <w:r>
+              <w:rPr>
+                <w:sz w:val="17"/>
+                <w:szCs w:val="17"/>
+              </w:rPr>
+              <w:t xml:space="preserve">PA</w:t>
+            </w:r>
+          </w:p>
+        </w:tc>
+        <w:tc>
+          <w:tcPr>
+            <w:tcW w:type="dxa" w:w="1000"/>
+            <w:tcMar>
+              <w:top w:type="dxa" w:w="40"/>
+              <w:left w:type="dxa" w:w="90"/>
+              <w:bottom w:type="dxa" w:w="40"/>
+              <w:right w:type="dxa" w:w="90"/>
+            </w:tcMar>
+          </w:tcPr>
+          <w:p>
+            <w:pPr>
+              <w:spacing w:after="0"/>
+            </w:pPr>
+            <w:r>
+              <w:rPr>
+                <w:sz w:val="17"/>
+                <w:szCs w:val="17"/>
+              </w:rPr>
+              <w:t xml:space="preserve">0,994</w:t>
+            </w:r>
+          </w:p>
+        </w:tc>
+        <w:tc>
+          <w:tcPr>
+            <w:tcW w:type="dxa" w:w="1100"/>
+            <w:tcMar>
+              <w:top w:type="dxa" w:w="40"/>
+              <w:left w:type="dxa" w:w="90"/>
+              <w:bottom w:type="dxa" w:w="40"/>
+              <w:right w:type="dxa" w:w="90"/>
+            </w:tcMar>
+          </w:tcPr>
+          <w:p>
+            <w:pPr>
+              <w:spacing w:after="0"/>
+            </w:pPr>
+            <w:r>
+              <w:rPr>
+                <w:sz w:val="17"/>
+                <w:szCs w:val="17"/>
+              </w:rPr>
+              <w:t xml:space="preserve">4</w:t>
+            </w:r>
+          </w:p>
+        </w:tc>
+        <w:tc>
+          <w:tcPr>
+            <w:tcW w:type="dxa" w:w="1100"/>
+            <w:tcMar>
+              <w:top w:type="dxa" w:w="40"/>
+              <w:left w:type="dxa" w:w="90"/>
+              <w:bottom w:type="dxa" w:w="40"/>
+              <w:right w:type="dxa" w:w="90"/>
+            </w:tcMar>
+          </w:tcPr>
+          <w:p>
+            <w:pPr>
+              <w:spacing w:after="0"/>
+            </w:pPr>
+            <w:r>
+              <w:rPr>
+                <w:sz w:val="17"/>
+                <w:szCs w:val="17"/>
+              </w:rPr>
+              <w:t xml:space="preserve">14</w:t>
+            </w:r>
+          </w:p>
+        </w:tc>
+      </w:tr>
+      <w:tr>
+        <w:tc>
+          <w:tcPr>
+            <w:tcW w:type="dxa" w:w="450"/>
+            <w:tcMar>
+              <w:top w:type="dxa" w:w="40"/>
+              <w:left w:type="dxa" w:w="90"/>
+              <w:bottom w:type="dxa" w:w="40"/>
+              <w:right w:type="dxa" w:w="90"/>
+            </w:tcMar>
+          </w:tcPr>
+          <w:p>
+            <w:pPr>
+              <w:spacing w:after="0"/>
+            </w:pPr>
+            <w:r>
+              <w:rPr>
+                <w:sz w:val="17"/>
+                <w:szCs w:val="17"/>
+              </w:rPr>
+              <w:t xml:space="preserve">14</w:t>
+            </w:r>
+          </w:p>
+        </w:tc>
+        <w:tc>
+          <w:tcPr>
+            <w:tcW w:type="dxa" w:w="2500"/>
+            <w:tcMar>
+              <w:top w:type="dxa" w:w="40"/>
+              <w:left w:type="dxa" w:w="90"/>
+              <w:bottom w:type="dxa" w:w="40"/>
+              <w:right w:type="dxa" w:w="90"/>
+            </w:tcMar>
+          </w:tcPr>
+          <w:p>
+            <w:pPr>
+              <w:spacing w:after="0"/>
+            </w:pPr>
+            <w:r>
+              <w:rPr>
+                <w:sz w:val="17"/>
+                <w:szCs w:val="17"/>
+              </w:rPr>
+              <w:t xml:space="preserve">Medicilândia</w:t>
+            </w:r>
+          </w:p>
+        </w:tc>
+        <w:tc>
+          <w:tcPr>
+            <w:tcW w:type="dxa" w:w="550"/>
+            <w:tcMar>
+              <w:top w:type="dxa" w:w="40"/>
+              <w:left w:type="dxa" w:w="90"/>
+              <w:bottom w:type="dxa" w:w="40"/>
+              <w:right w:type="dxa" w:w="90"/>
+            </w:tcMar>
+          </w:tcPr>
+          <w:p>
+            <w:pPr>
+              <w:spacing w:after="0"/>
+            </w:pPr>
+            <w:r>
+              <w:rPr>
+                <w:sz w:val="17"/>
+                <w:szCs w:val="17"/>
+              </w:rPr>
+              <w:t xml:space="preserve">PA</w:t>
+            </w:r>
+          </w:p>
+        </w:tc>
+        <w:tc>
+          <w:tcPr>
+            <w:tcW w:type="dxa" w:w="1000"/>
+            <w:tcMar>
+              <w:top w:type="dxa" w:w="40"/>
+              <w:left w:type="dxa" w:w="90"/>
+              <w:bottom w:type="dxa" w:w="40"/>
+              <w:right w:type="dxa" w:w="90"/>
+            </w:tcMar>
+          </w:tcPr>
+          <w:p>
+            <w:pPr>
+              <w:spacing w:after="0"/>
+            </w:pPr>
+            <w:r>
+              <w:rPr>
+                <w:sz w:val="17"/>
+                <w:szCs w:val="17"/>
+              </w:rPr>
+              <w:t xml:space="preserve">0,988</w:t>
+            </w:r>
+          </w:p>
+        </w:tc>
+        <w:tc>
+          <w:tcPr>
+            <w:tcW w:type="dxa" w:w="1100"/>
+            <w:tcMar>
+              <w:top w:type="dxa" w:w="40"/>
+              <w:left w:type="dxa" w:w="90"/>
+              <w:bottom w:type="dxa" w:w="40"/>
+              <w:right w:type="dxa" w:w="90"/>
+            </w:tcMar>
+          </w:tcPr>
+          <w:p>
+            <w:pPr>
+              <w:spacing w:after="0"/>
+            </w:pPr>
+            <w:r>
+              <w:rPr>
+                <w:sz w:val="17"/>
+                <w:szCs w:val="17"/>
+              </w:rPr>
+              <w:t xml:space="preserve">4</w:t>
+            </w:r>
+          </w:p>
+        </w:tc>
+        <w:tc>
+          <w:tcPr>
+            <w:tcW w:type="dxa" w:w="1100"/>
+            <w:tcMar>
+              <w:top w:type="dxa" w:w="40"/>
+              <w:left w:type="dxa" w:w="90"/>
+              <w:bottom w:type="dxa" w:w="40"/>
+              <w:right w:type="dxa" w:w="90"/>
+            </w:tcMar>
+          </w:tcPr>
+          <w:p>
+            <w:pPr>
+              <w:spacing w:after="0"/>
+            </w:pPr>
+            <w:r>
+              <w:rPr>
+                <w:sz w:val="17"/>
+                <w:szCs w:val="17"/>
+              </w:rPr>
+              <w:t xml:space="preserve">14</w:t>
+            </w:r>
+          </w:p>
+        </w:tc>
+      </w:tr>
+      <w:tr>
+        <w:tc>
+          <w:tcPr>
+            <w:tcW w:type="dxa" w:w="450"/>
+            <w:tcMar>
+              <w:top w:type="dxa" w:w="40"/>
+              <w:left w:type="dxa" w:w="90"/>
+              <w:bottom w:type="dxa" w:w="40"/>
+              <w:right w:type="dxa" w:w="90"/>
+            </w:tcMar>
+          </w:tcPr>
+          <w:p>
+            <w:pPr>
+              <w:spacing w:after="0"/>
+            </w:pPr>
+            <w:r>
+              <w:rPr>
+                <w:sz w:val="17"/>
+                <w:szCs w:val="17"/>
+              </w:rPr>
+              <w:t xml:space="preserve">15</w:t>
+            </w:r>
+          </w:p>
+        </w:tc>
+        <w:tc>
+          <w:tcPr>
+            <w:tcW w:type="dxa" w:w="2500"/>
+            <w:tcMar>
+              <w:top w:type="dxa" w:w="40"/>
+              <w:left w:type="dxa" w:w="90"/>
+              <w:bottom w:type="dxa" w:w="40"/>
+              <w:right w:type="dxa" w:w="90"/>
+            </w:tcMar>
+          </w:tcPr>
+          <w:p>
+            <w:pPr>
+              <w:spacing w:after="0"/>
+            </w:pPr>
+            <w:r>
+              <w:rPr>
+                <w:sz w:val="17"/>
+                <w:szCs w:val="17"/>
+              </w:rPr>
+              <w:t xml:space="preserve">São Domingos do Maranhão</w:t>
+            </w:r>
+          </w:p>
+        </w:tc>
+        <w:tc>
+          <w:tcPr>
+            <w:tcW w:type="dxa" w:w="550"/>
+            <w:tcMar>
+              <w:top w:type="dxa" w:w="40"/>
+              <w:left w:type="dxa" w:w="90"/>
+              <w:bottom w:type="dxa" w:w="40"/>
+              <w:right w:type="dxa" w:w="90"/>
+            </w:tcMar>
+          </w:tcPr>
+          <w:p>
+            <w:pPr>
+              <w:spacing w:after="0"/>
+            </w:pPr>
+            <w:r>
+              <w:rPr>
+                <w:sz w:val="17"/>
+                <w:szCs w:val="17"/>
+              </w:rPr>
+              <w:t xml:space="preserve">MA</w:t>
+            </w:r>
+          </w:p>
+        </w:tc>
+        <w:tc>
+          <w:tcPr>
+            <w:tcW w:type="dxa" w:w="1000"/>
+            <w:tcMar>
+              <w:top w:type="dxa" w:w="40"/>
+              <w:left w:type="dxa" w:w="90"/>
+              <w:bottom w:type="dxa" w:w="40"/>
+              <w:right w:type="dxa" w:w="90"/>
+            </w:tcMar>
+          </w:tcPr>
+          <w:p>
+            <w:pPr>
+              <w:spacing w:after="0"/>
+            </w:pPr>
+            <w:r>
+              <w:rPr>
+                <w:sz w:val="17"/>
+                <w:szCs w:val="17"/>
+              </w:rPr>
+              <w:t xml:space="preserve">0,984</w:t>
+            </w:r>
+          </w:p>
+        </w:tc>
+        <w:tc>
+          <w:tcPr>
+            <w:tcW w:type="dxa" w:w="1100"/>
+            <w:tcMar>
+              <w:top w:type="dxa" w:w="40"/>
+              <w:left w:type="dxa" w:w="90"/>
+              <w:bottom w:type="dxa" w:w="40"/>
+              <w:right w:type="dxa" w:w="90"/>
+            </w:tcMar>
+          </w:tcPr>
+          <w:p>
+            <w:pPr>
+              <w:spacing w:after="0"/>
+            </w:pPr>
+            <w:r>
+              <w:rPr>
+                <w:sz w:val="17"/>
+                <w:szCs w:val="17"/>
+              </w:rPr>
+              <w:t xml:space="preserve">15</w:t>
+            </w:r>
+          </w:p>
+        </w:tc>
+        <w:tc>
+          <w:tcPr>
+            <w:tcW w:type="dxa" w:w="1100"/>
+            <w:tcMar>
+              <w:top w:type="dxa" w:w="40"/>
+              <w:left w:type="dxa" w:w="90"/>
+              <w:bottom w:type="dxa" w:w="40"/>
+              <w:right w:type="dxa" w:w="90"/>
+            </w:tcMar>
+          </w:tcPr>
+          <w:p>
+            <w:pPr>
+              <w:spacing w:after="0"/>
+            </w:pPr>
+            <w:r>
+              <w:rPr>
+                <w:sz w:val="17"/>
+                <w:szCs w:val="17"/>
+              </w:rPr>
+              <w:t xml:space="preserve">3</w:t>
+            </w:r>
+          </w:p>
+        </w:tc>
+      </w:tr>
+      <w:tr>
+        <w:tc>
+          <w:tcPr>
+            <w:tcW w:type="dxa" w:w="450"/>
+            <w:tcMar>
+              <w:top w:type="dxa" w:w="40"/>
+              <w:left w:type="dxa" w:w="90"/>
+              <w:bottom w:type="dxa" w:w="40"/>
+              <w:right w:type="dxa" w:w="90"/>
+            </w:tcMar>
+          </w:tcPr>
+          <w:p>
+            <w:pPr>
+              <w:spacing w:after="0"/>
+            </w:pPr>
+            <w:r>
+              <w:rPr>
+                <w:sz w:val="17"/>
+                <w:szCs w:val="17"/>
+              </w:rPr>
+              <w:t xml:space="preserve">16</w:t>
+            </w:r>
+          </w:p>
+        </w:tc>
+        <w:tc>
+          <w:tcPr>
+            <w:tcW w:type="dxa" w:w="2500"/>
+            <w:tcMar>
+              <w:top w:type="dxa" w:w="40"/>
+              <w:left w:type="dxa" w:w="90"/>
+              <w:bottom w:type="dxa" w:w="40"/>
+              <w:right w:type="dxa" w:w="90"/>
+            </w:tcMar>
+          </w:tcPr>
+          <w:p>
+            <w:pPr>
+              <w:spacing w:after="0"/>
+            </w:pPr>
+            <w:r>
+              <w:rPr>
+                <w:sz w:val="17"/>
+                <w:szCs w:val="17"/>
+              </w:rPr>
+              <w:t xml:space="preserve">Prainha</w:t>
+            </w:r>
+          </w:p>
+        </w:tc>
+        <w:tc>
+          <w:tcPr>
+            <w:tcW w:type="dxa" w:w="550"/>
+            <w:tcMar>
+              <w:top w:type="dxa" w:w="40"/>
+              <w:left w:type="dxa" w:w="90"/>
+              <w:bottom w:type="dxa" w:w="40"/>
+              <w:right w:type="dxa" w:w="90"/>
+            </w:tcMar>
+          </w:tcPr>
+          <w:p>
+            <w:pPr>
+              <w:spacing w:after="0"/>
+            </w:pPr>
+            <w:r>
+              <w:rPr>
+                <w:sz w:val="17"/>
+                <w:szCs w:val="17"/>
+              </w:rPr>
+              <w:t xml:space="preserve">PA</w:t>
+            </w:r>
+          </w:p>
+        </w:tc>
+        <w:tc>
+          <w:tcPr>
+            <w:tcW w:type="dxa" w:w="1000"/>
+            <w:tcMar>
+              <w:top w:type="dxa" w:w="40"/>
+              <w:left w:type="dxa" w:w="90"/>
+              <w:bottom w:type="dxa" w:w="40"/>
+              <w:right w:type="dxa" w:w="90"/>
+            </w:tcMar>
+          </w:tcPr>
+          <w:p>
+            <w:pPr>
+              <w:spacing w:after="0"/>
+            </w:pPr>
+            <w:r>
+              <w:rPr>
+                <w:sz w:val="17"/>
+                <w:szCs w:val="17"/>
+              </w:rPr>
+              <w:t xml:space="preserve">0,980</w:t>
+            </w:r>
+          </w:p>
+        </w:tc>
+        <w:tc>
+          <w:tcPr>
+            <w:tcW w:type="dxa" w:w="1100"/>
+            <w:tcMar>
+              <w:top w:type="dxa" w:w="40"/>
+              <w:left w:type="dxa" w:w="90"/>
+              <w:bottom w:type="dxa" w:w="40"/>
+              <w:right w:type="dxa" w:w="90"/>
+            </w:tcMar>
+          </w:tcPr>
+          <w:p>
+            <w:pPr>
+              <w:spacing w:after="0"/>
+            </w:pPr>
+            <w:r>
+              <w:rPr>
+                <w:sz w:val="17"/>
+                <w:szCs w:val="17"/>
+              </w:rPr>
+              <w:t xml:space="preserve">3</w:t>
+            </w:r>
+          </w:p>
+        </w:tc>
+        <w:tc>
+          <w:tcPr>
+            <w:tcW w:type="dxa" w:w="1100"/>
+            <w:tcMar>
+              <w:top w:type="dxa" w:w="40"/>
+              <w:left w:type="dxa" w:w="90"/>
+              <w:bottom w:type="dxa" w:w="40"/>
+              <w:right w:type="dxa" w:w="90"/>
+            </w:tcMar>
+          </w:tcPr>
+          <w:p>
+            <w:pPr>
+              <w:spacing w:after="0"/>
+            </w:pPr>
+            <w:r>
+              <w:rPr>
+                <w:sz w:val="17"/>
+                <w:szCs w:val="17"/>
+              </w:rPr>
+              <w:t xml:space="preserve">15</w:t>
+            </w:r>
+          </w:p>
+        </w:tc>
+      </w:tr>
+      <w:tr>
+        <w:tc>
+          <w:tcPr>
+            <w:tcW w:type="dxa" w:w="450"/>
+            <w:tcMar>
+              <w:top w:type="dxa" w:w="40"/>
+              <w:left w:type="dxa" w:w="90"/>
+              <w:bottom w:type="dxa" w:w="40"/>
+              <w:right w:type="dxa" w:w="90"/>
+            </w:tcMar>
+          </w:tcPr>
+          <w:p>
+            <w:pPr>
+              <w:spacing w:after="0"/>
+            </w:pPr>
+            <w:r>
+              <w:rPr>
+                <w:sz w:val="17"/>
+                <w:szCs w:val="17"/>
+              </w:rPr>
+              <w:t xml:space="preserve">17</w:t>
+            </w:r>
+          </w:p>
+        </w:tc>
+        <w:tc>
+          <w:tcPr>
+            <w:tcW w:type="dxa" w:w="2500"/>
+            <w:tcMar>
+              <w:top w:type="dxa" w:w="40"/>
+              <w:left w:type="dxa" w:w="90"/>
+              <w:bottom w:type="dxa" w:w="40"/>
+              <w:right w:type="dxa" w:w="90"/>
+            </w:tcMar>
+          </w:tcPr>
+          <w:p>
+            <w:pPr>
+              <w:spacing w:after="0"/>
+            </w:pPr>
+            <w:r>
+              <w:rPr>
+                <w:sz w:val="17"/>
+                <w:szCs w:val="17"/>
+              </w:rPr>
+              <w:t xml:space="preserve">Santana do Araguaia</w:t>
+            </w:r>
+          </w:p>
+        </w:tc>
+        <w:tc>
+          <w:tcPr>
+            <w:tcW w:type="dxa" w:w="550"/>
+            <w:tcMar>
+              <w:top w:type="dxa" w:w="40"/>
+              <w:left w:type="dxa" w:w="90"/>
+              <w:bottom w:type="dxa" w:w="40"/>
+              <w:right w:type="dxa" w:w="90"/>
+            </w:tcMar>
+          </w:tcPr>
+          <w:p>
+            <w:pPr>
+              <w:spacing w:after="0"/>
+            </w:pPr>
+            <w:r>
+              <w:rPr>
+                <w:sz w:val="17"/>
+                <w:szCs w:val="17"/>
+              </w:rPr>
+              <w:t xml:space="preserve">PA</w:t>
+            </w:r>
+          </w:p>
+        </w:tc>
+        <w:tc>
+          <w:tcPr>
+            <w:tcW w:type="dxa" w:w="1000"/>
+            <w:tcMar>
+              <w:top w:type="dxa" w:w="40"/>
+              <w:left w:type="dxa" w:w="90"/>
+              <w:bottom w:type="dxa" w:w="40"/>
+              <w:right w:type="dxa" w:w="90"/>
+            </w:tcMar>
+          </w:tcPr>
+          <w:p>
+            <w:pPr>
+              <w:spacing w:after="0"/>
+            </w:pPr>
+            <w:r>
+              <w:rPr>
+                <w:sz w:val="17"/>
+                <w:szCs w:val="17"/>
+              </w:rPr>
+              <w:t xml:space="preserve">0,957</w:t>
+            </w:r>
+          </w:p>
+        </w:tc>
+        <w:tc>
+          <w:tcPr>
+            <w:tcW w:type="dxa" w:w="1100"/>
+            <w:tcMar>
+              <w:top w:type="dxa" w:w="40"/>
+              <w:left w:type="dxa" w:w="90"/>
+              <w:bottom w:type="dxa" w:w="40"/>
+              <w:right w:type="dxa" w:w="90"/>
+            </w:tcMar>
+          </w:tcPr>
+          <w:p>
+            <w:pPr>
+              <w:spacing w:after="0"/>
+            </w:pPr>
+            <w:r>
+              <w:rPr>
+                <w:sz w:val="17"/>
+                <w:szCs w:val="17"/>
+              </w:rPr>
+              <w:t xml:space="preserve">9</w:t>
+            </w:r>
+          </w:p>
+        </w:tc>
+        <w:tc>
+          <w:tcPr>
+            <w:tcW w:type="dxa" w:w="1100"/>
+            <w:tcMar>
+              <w:top w:type="dxa" w:w="40"/>
+              <w:left w:type="dxa" w:w="90"/>
+              <w:bottom w:type="dxa" w:w="40"/>
+              <w:right w:type="dxa" w:w="90"/>
+            </w:tcMar>
+          </w:tcPr>
+          <w:p>
+            <w:pPr>
+              <w:spacing w:after="0"/>
+            </w:pPr>
+            <w:r>
+              <w:rPr>
+                <w:sz w:val="17"/>
+                <w:szCs w:val="17"/>
+              </w:rPr>
+              <w:t xml:space="preserve">9</w:t>
+            </w:r>
+          </w:p>
+        </w:tc>
+      </w:tr>
+      <w:tr>
+        <w:tc>
+          <w:tcPr>
+            <w:tcW w:type="dxa" w:w="450"/>
+            <w:tcMar>
+              <w:top w:type="dxa" w:w="40"/>
+              <w:left w:type="dxa" w:w="90"/>
+              <w:bottom w:type="dxa" w:w="40"/>
+              <w:right w:type="dxa" w:w="90"/>
+            </w:tcMar>
+          </w:tcPr>
+          <w:p>
+            <w:pPr>
+              <w:spacing w:after="0"/>
+            </w:pPr>
+            <w:r>
+              <w:rPr>
+                <w:sz w:val="17"/>
+                <w:szCs w:val="17"/>
+              </w:rPr>
+              <w:t xml:space="preserve">18</w:t>
+            </w:r>
+          </w:p>
+        </w:tc>
+        <w:tc>
+          <w:tcPr>
+            <w:tcW w:type="dxa" w:w="2500"/>
+            <w:tcMar>
+              <w:top w:type="dxa" w:w="40"/>
+              <w:left w:type="dxa" w:w="90"/>
+              <w:bottom w:type="dxa" w:w="40"/>
+              <w:right w:type="dxa" w:w="90"/>
+            </w:tcMar>
+          </w:tcPr>
+          <w:p>
+            <w:pPr>
+              <w:spacing w:after="0"/>
+            </w:pPr>
+            <w:r>
+              <w:rPr>
+                <w:sz w:val="17"/>
+                <w:szCs w:val="17"/>
+              </w:rPr>
+              <w:t xml:space="preserve">Autazes</w:t>
+            </w:r>
+          </w:p>
+        </w:tc>
+        <w:tc>
+          <w:tcPr>
+            <w:tcW w:type="dxa" w:w="550"/>
+            <w:tcMar>
+              <w:top w:type="dxa" w:w="40"/>
+              <w:left w:type="dxa" w:w="90"/>
+              <w:bottom w:type="dxa" w:w="40"/>
+              <w:right w:type="dxa" w:w="90"/>
+            </w:tcMar>
+          </w:tcPr>
+          <w:p>
+            <w:pPr>
+              <w:spacing w:after="0"/>
+            </w:pPr>
+            <w:r>
+              <w:rPr>
+                <w:sz w:val="17"/>
+                <w:szCs w:val="17"/>
+              </w:rPr>
+              <w:t xml:space="preserve">AM</w:t>
+            </w:r>
+          </w:p>
+        </w:tc>
+        <w:tc>
+          <w:tcPr>
+            <w:tcW w:type="dxa" w:w="1000"/>
+            <w:tcMar>
+              <w:top w:type="dxa" w:w="40"/>
+              <w:left w:type="dxa" w:w="90"/>
+              <w:bottom w:type="dxa" w:w="40"/>
+              <w:right w:type="dxa" w:w="90"/>
+            </w:tcMar>
+          </w:tcPr>
+          <w:p>
+            <w:pPr>
+              <w:spacing w:after="0"/>
+            </w:pPr>
+            <w:r>
+              <w:rPr>
+                <w:sz w:val="17"/>
+                <w:szCs w:val="17"/>
+              </w:rPr>
+              <w:t xml:space="preserve">0,947</w:t>
+            </w:r>
+          </w:p>
+        </w:tc>
+        <w:tc>
+          <w:tcPr>
+            <w:tcW w:type="dxa" w:w="1100"/>
+            <w:tcMar>
+              <w:top w:type="dxa" w:w="40"/>
+              <w:left w:type="dxa" w:w="90"/>
+              <w:bottom w:type="dxa" w:w="40"/>
+              <w:right w:type="dxa" w:w="90"/>
+            </w:tcMar>
+          </w:tcPr>
+          <w:p>
+            <w:pPr>
+              <w:spacing w:after="0"/>
+            </w:pPr>
+            <w:r>
+              <w:rPr>
+                <w:sz w:val="17"/>
+                <w:szCs w:val="17"/>
+              </w:rPr>
+              <w:t xml:space="preserve">7</w:t>
+            </w:r>
+          </w:p>
+        </w:tc>
+        <w:tc>
+          <w:tcPr>
+            <w:tcW w:type="dxa" w:w="1100"/>
+            <w:tcMar>
+              <w:top w:type="dxa" w:w="40"/>
+              <w:left w:type="dxa" w:w="90"/>
+              <w:bottom w:type="dxa" w:w="40"/>
+              <w:right w:type="dxa" w:w="90"/>
+            </w:tcMar>
+          </w:tcPr>
+          <w:p>
+            <w:pPr>
+              <w:spacing w:after="0"/>
+            </w:pPr>
+            <w:r>
+              <w:rPr>
+                <w:sz w:val="17"/>
+                <w:szCs w:val="17"/>
+              </w:rPr>
+              <w:t xml:space="preserve">11</w:t>
+            </w:r>
+          </w:p>
+        </w:tc>
+      </w:tr>
+      <w:tr>
+        <w:tc>
+          <w:tcPr>
+            <w:tcW w:type="dxa" w:w="450"/>
+            <w:tcMar>
+              <w:top w:type="dxa" w:w="40"/>
+              <w:left w:type="dxa" w:w="90"/>
+              <w:bottom w:type="dxa" w:w="40"/>
+              <w:right w:type="dxa" w:w="90"/>
+            </w:tcMar>
+          </w:tcPr>
+          <w:p>
+            <w:pPr>
+              <w:spacing w:after="0"/>
+            </w:pPr>
+            <w:r>
+              <w:rPr>
+                <w:sz w:val="17"/>
+                <w:szCs w:val="17"/>
+              </w:rPr>
+              <w:t xml:space="preserve">19</w:t>
+            </w:r>
+          </w:p>
+        </w:tc>
+        <w:tc>
+          <w:tcPr>
+            <w:tcW w:type="dxa" w:w="2500"/>
+            <w:tcMar>
+              <w:top w:type="dxa" w:w="40"/>
+              <w:left w:type="dxa" w:w="90"/>
+              <w:bottom w:type="dxa" w:w="40"/>
+              <w:right w:type="dxa" w:w="90"/>
+            </w:tcMar>
+          </w:tcPr>
+          <w:p>
+            <w:pPr>
+              <w:spacing w:after="0"/>
+            </w:pPr>
+            <w:r>
+              <w:rPr>
+                <w:sz w:val="17"/>
+                <w:szCs w:val="17"/>
+              </w:rPr>
+              <w:t xml:space="preserve">Oriximiná</w:t>
+            </w:r>
+          </w:p>
+        </w:tc>
+        <w:tc>
+          <w:tcPr>
+            <w:tcW w:type="dxa" w:w="550"/>
+            <w:tcMar>
+              <w:top w:type="dxa" w:w="40"/>
+              <w:left w:type="dxa" w:w="90"/>
+              <w:bottom w:type="dxa" w:w="40"/>
+              <w:right w:type="dxa" w:w="90"/>
+            </w:tcMar>
+          </w:tcPr>
+          <w:p>
+            <w:pPr>
+              <w:spacing w:after="0"/>
+            </w:pPr>
+            <w:r>
+              <w:rPr>
+                <w:sz w:val="17"/>
+                <w:szCs w:val="17"/>
+              </w:rPr>
+              <w:t xml:space="preserve">PA</w:t>
+            </w:r>
+          </w:p>
+        </w:tc>
+        <w:tc>
+          <w:tcPr>
+            <w:tcW w:type="dxa" w:w="1000"/>
+            <w:tcMar>
+              <w:top w:type="dxa" w:w="40"/>
+              <w:left w:type="dxa" w:w="90"/>
+              <w:bottom w:type="dxa" w:w="40"/>
+              <w:right w:type="dxa" w:w="90"/>
+            </w:tcMar>
+          </w:tcPr>
+          <w:p>
+            <w:pPr>
+              <w:spacing w:after="0"/>
+            </w:pPr>
+            <w:r>
+              <w:rPr>
+                <w:sz w:val="17"/>
+                <w:szCs w:val="17"/>
+              </w:rPr>
+              <w:t xml:space="preserve">0,944</w:t>
+            </w:r>
+          </w:p>
+        </w:tc>
+        <w:tc>
+          <w:tcPr>
+            <w:tcW w:type="dxa" w:w="1100"/>
+            <w:tcMar>
+              <w:top w:type="dxa" w:w="40"/>
+              <w:left w:type="dxa" w:w="90"/>
+              <w:bottom w:type="dxa" w:w="40"/>
+              <w:right w:type="dxa" w:w="90"/>
+            </w:tcMar>
+          </w:tcPr>
+          <w:p>
+            <w:pPr>
+              <w:spacing w:after="0"/>
+            </w:pPr>
+            <w:r>
+              <w:rPr>
+                <w:sz w:val="17"/>
+                <w:szCs w:val="17"/>
+              </w:rPr>
+              <w:t xml:space="preserve">8</w:t>
+            </w:r>
+          </w:p>
+        </w:tc>
+        <w:tc>
+          <w:tcPr>
+            <w:tcW w:type="dxa" w:w="1100"/>
+            <w:tcMar>
+              <w:top w:type="dxa" w:w="40"/>
+              <w:left w:type="dxa" w:w="90"/>
+              <w:bottom w:type="dxa" w:w="40"/>
+              <w:right w:type="dxa" w:w="90"/>
+            </w:tcMar>
+          </w:tcPr>
+          <w:p>
+            <w:pPr>
+              <w:spacing w:after="0"/>
+            </w:pPr>
+            <w:r>
+              <w:rPr>
+                <w:sz w:val="17"/>
+                <w:szCs w:val="17"/>
+              </w:rPr>
+              <w:t xml:space="preserve">10</w:t>
+            </w:r>
+          </w:p>
+        </w:tc>
+      </w:tr>
+      <w:tr>
+        <w:tc>
+          <w:tcPr>
+            <w:tcW w:type="dxa" w:w="450"/>
+            <w:tcMar>
+              <w:top w:type="dxa" w:w="40"/>
+              <w:left w:type="dxa" w:w="90"/>
+              <w:bottom w:type="dxa" w:w="40"/>
+              <w:right w:type="dxa" w:w="90"/>
+            </w:tcMar>
+          </w:tcPr>
+          <w:p>
+            <w:pPr>
+              <w:spacing w:after="0"/>
+            </w:pPr>
+            <w:r>
+              <w:rPr>
+                <w:sz w:val="17"/>
+                <w:szCs w:val="17"/>
+              </w:rPr>
+              <w:t xml:space="preserve">20</w:t>
+            </w:r>
+          </w:p>
+        </w:tc>
+        <w:tc>
+          <w:tcPr>
+            <w:tcW w:type="dxa" w:w="2500"/>
+            <w:tcMar>
+              <w:top w:type="dxa" w:w="40"/>
+              <w:left w:type="dxa" w:w="90"/>
+              <w:bottom w:type="dxa" w:w="40"/>
+              <w:right w:type="dxa" w:w="90"/>
+            </w:tcMar>
+          </w:tcPr>
+          <w:p>
+            <w:pPr>
+              <w:spacing w:after="0"/>
+            </w:pPr>
+            <w:r>
+              <w:rPr>
+                <w:sz w:val="17"/>
+                <w:szCs w:val="17"/>
+              </w:rPr>
+              <w:t xml:space="preserve">Ipixuna do Pará</w:t>
+            </w:r>
+          </w:p>
+        </w:tc>
+        <w:tc>
+          <w:tcPr>
+            <w:tcW w:type="dxa" w:w="550"/>
+            <w:tcMar>
+              <w:top w:type="dxa" w:w="40"/>
+              <w:left w:type="dxa" w:w="90"/>
+              <w:bottom w:type="dxa" w:w="40"/>
+              <w:right w:type="dxa" w:w="90"/>
+            </w:tcMar>
+          </w:tcPr>
+          <w:p>
+            <w:pPr>
+              <w:spacing w:after="0"/>
+            </w:pPr>
+            <w:r>
+              <w:rPr>
+                <w:sz w:val="17"/>
+                <w:szCs w:val="17"/>
+              </w:rPr>
+              <w:t xml:space="preserve">PA</w:t>
+            </w:r>
+          </w:p>
+        </w:tc>
+        <w:tc>
+          <w:tcPr>
+            <w:tcW w:type="dxa" w:w="1000"/>
+            <w:tcMar>
+              <w:top w:type="dxa" w:w="40"/>
+              <w:left w:type="dxa" w:w="90"/>
+              <w:bottom w:type="dxa" w:w="40"/>
+              <w:right w:type="dxa" w:w="90"/>
+            </w:tcMar>
+          </w:tcPr>
+          <w:p>
+            <w:pPr>
+              <w:spacing w:after="0"/>
+            </w:pPr>
+            <w:r>
+              <w:rPr>
+                <w:sz w:val="17"/>
+                <w:szCs w:val="17"/>
+              </w:rPr>
+              <w:t xml:space="preserve">0,939</w:t>
+            </w:r>
+          </w:p>
+        </w:tc>
+        <w:tc>
+          <w:tcPr>
+            <w:tcW w:type="dxa" w:w="1100"/>
+            <w:tcMar>
+              <w:top w:type="dxa" w:w="40"/>
+              <w:left w:type="dxa" w:w="90"/>
+              <w:bottom w:type="dxa" w:w="40"/>
+              <w:right w:type="dxa" w:w="90"/>
+            </w:tcMar>
+          </w:tcPr>
+          <w:p>
+            <w:pPr>
+              <w:spacing w:after="0"/>
+            </w:pPr>
+            <w:r>
+              <w:rPr>
+                <w:sz w:val="17"/>
+                <w:szCs w:val="17"/>
+              </w:rPr>
+              <w:t xml:space="preserve">7</w:t>
+            </w:r>
+          </w:p>
+        </w:tc>
+        <w:tc>
+          <w:tcPr>
+            <w:tcW w:type="dxa" w:w="1100"/>
+            <w:tcMar>
+              <w:top w:type="dxa" w:w="40"/>
+              <w:left w:type="dxa" w:w="90"/>
+              <w:bottom w:type="dxa" w:w="40"/>
+              <w:right w:type="dxa" w:w="90"/>
+            </w:tcMar>
+          </w:tcPr>
+          <w:p>
+            <w:pPr>
+              <w:spacing w:after="0"/>
+            </w:pPr>
+            <w:r>
+              <w:rPr>
+                <w:sz w:val="17"/>
+                <w:szCs w:val="17"/>
+              </w:rPr>
+              <w:t xml:space="preserve">11</w:t>
+            </w:r>
+          </w:p>
+        </w:tc>
+      </w:tr>
+    </w:tbl>
+    <w:p>
+      <w:pPr>
+        <w:jc w:val="center"/>
+      </w:pPr>
+      <w:r>
+        <w:rPr>
+          <w:i/>
+          <w:color w:val="000000"/>
+          <w:sz w:val="18"/>
+        </w:rPr>
+        <w:t>Tabela 1. Os vinte primeiros do ranking, ordenados pela média do EGS nos dezoito anos. As duas últimas colunas somam 18 em todos: o topo tem pressão material em todos os anos da série, e o que varia entre eles é a proporção de anos sem nenhuma multa federal.</w:t>
       </w:r>
     </w:p>
     <w:p>
@@ -202,7 +3198,7 @@
           <w:color w:val="000000"/>
           <w:sz w:val="18"/>
         </w:rPr>
-        <w:t>Figura 1. Enforcement Gap Score médio (2008-2025) por quintil. Escala ordinal (rank), nunca valor bruto; contorno grosso = top 20 do ranking.</w:t>
+        <w:t>Figura 1. Enforcement Gap Score médio (2008-2025) por quintil, entre os 552 municípios com pressão material. Escala ordinal (rank), nunca valor bruto; em cinza, fora da rampa, os 220 municípios que nunca tiveram um ano acima do limiar de 1 km², porque onde não houve pressão não há lacuna a medir; contorno grosso = top 20 do ranking.</w:t>
       </w:r>
     </w:p>
     <w:p>
@@ -262,7 +3258,7 @@
           <w:color w:val="000000"/>
           <w:sz w:val="18"/>
         </w:rPr>
-        <w:t>Figura 2. Resposta federal por quintil (autos e multas deflacionadas combinados); vermelho = pressão material sem nenhuma multa (66 municípios); cinza = sem pressão medida; contorno grosso = top 20 EGS.</w:t>
+        <w:t>Figura 2. Em vermelho, os 66 municípios que tiveram pressão material e nunca foram multados pela União em dezoito anos: a lacuna absoluta no grão municipal. O azul ordena por quintil a resposta federal onde ela existiu, medida como a média geométrica dos logaritmos de autos e de multas deflacionadas, entre os 486 municípios com multa; cinza = sem pressão medida (220); contorno grosso = top 20 EGS.</w:t>
       </w:r>
     </w:p>
     <w:p>

</xml_diff>

<commit_message>
docs: equacao em padrao ABNT, propriedades do indice na secao 3, fases viram rodadas
</commit_message>
<xml_diff>
--- a/deliverables/EGMS_01_resumo_executivo.docx
+++ b/deliverables/EGMS_01_resumo_executivo.docx
@@ -89,37 +89,68 @@
         <w:t xml:space="preserve">Enforcement Gap Score (EGS)</w:t>
       </w:r>
       <w:r>
-        <w:t xml:space="preserve">.</w:t>
+        <w:t>, definido na equação (1).</w:t>
       </w:r>
     </w:p>
     <w:p>
       <w:pPr>
-        <w:shd w:fill="F2F4F1" w:val="clear"/>
+        <w:tabs>
+          <w:tab w:pos="4536" w:val="center"/>
+          <w:tab w:pos="9072" w:val="right"/>
+        </w:tabs>
         <w:spacing w:after="40" w:before="40"/>
         <w:ind w:left="360"/>
-      </w:pPr>
+        <w:jc w:val="left"/>
+      </w:pPr>
+      <w:r>
+        <w:tab/>
+      </w:r>
+      <w:r>
+        <w:drawing>
+          <wp:inline xmlns:a="http://schemas.openxmlformats.org/drawingml/2006/main" xmlns:pic="http://schemas.openxmlformats.org/drawingml/2006/picture">
+            <wp:extent cx="4389120" cy="1084951"/>
+            <wp:docPr id="4" name="Picture 4"/>
+            <wp:cNvGraphicFramePr>
+              <a:graphicFrameLocks noChangeAspect="1"/>
+            </wp:cNvGraphicFramePr>
+            <a:graphic>
+              <a:graphicData uri="http://schemas.openxmlformats.org/drawingml/2006/picture">
+                <pic:pic>
+                  <pic:nvPicPr>
+                    <pic:cNvPr id="0" name="image.png"/>
+                    <pic:cNvPicPr/>
+                  </pic:nvPicPr>
+                  <pic:blipFill>
+                    <a:blip r:embed="rId13"/>
+                    <a:stretch>
+                      <a:fillRect/>
+                    </a:stretch>
+                  </pic:blipFill>
+                  <pic:spPr>
+                    <a:xfrm>
+                      <a:off x="0" y="0"/>
+                      <a:ext cx="4389120" cy="1084951"/>
+                    </a:xfrm>
+                    <a:prstGeom prst="rect"/>
+                  </pic:spPr>
+                </pic:pic>
+              </a:graphicData>
+            </a:graphic>
+          </wp:inline>
+        </w:drawing>
+      </w:r>
       <w:r>
         <w:rPr>
-          <w:rFonts w:ascii="Times New Roman" w:cs="Times New Roman" w:eastAsia="Consolas" w:hAnsi="Times New Roman"/>
-          <w:sz w:val="19"/>
-          <w:szCs w:val="19"/>
+          <w:position w:val="76"/>
         </w:rPr>
-        <w:t xml:space="preserve">EGS = log(1 + área desmatada) / max(1, √(log(1 + nº autos) × log(1 + multas reais)))</w:t>
+        <w:tab/>
+        <w:t>(1)</w:t>
       </w:r>
     </w:p>
     <w:p>
-      <w:pPr>
-        <w:shd w:fill="F2F4F1" w:val="clear"/>
-        <w:spacing w:after="40" w:before="40"/>
-        <w:ind w:left="360"/>
-      </w:pPr>
-      <w:r>
-        <w:rPr>
-          <w:rFonts w:ascii="Times New Roman" w:cs="Times New Roman" w:eastAsia="Consolas" w:hAnsi="Times New Roman"/>
-          <w:sz w:val="19"/>
-          <w:szCs w:val="19"/>
-        </w:rPr>
-        <w:t xml:space="preserve">EGS = 0 quando a área do ano fica abaixo de 1 km²  ·  multas deflacionadas (IPCA, base 2025)</w:t>
+      <w:pPr/>
+      <w:r>
+        <w:t>onde A = km² desmatados no município no ano; N = autos de infração federais; M = valor das multas, deflacionado (IPCA, base 2025).</w:t>
       </w:r>
     </w:p>
     <w:p>
@@ -147,7 +178,6 @@
     </w:p>
     <w:tbl>
       <w:tblPr>
-        <w:tblW w:type="dxa" w:w="6700"/>
         <w:tblBorders>
           <w:top w:val="single" w:color="auto" w:sz="4"/>
           <w:left w:val="single" w:color="auto" w:sz="4"/>
@@ -156,19 +186,21 @@
           <w:insideH w:val="single" w:color="auto" w:sz="4"/>
           <w:insideV w:val="single" w:color="auto" w:sz="4"/>
         </w:tblBorders>
+        <w:tblLayout w:type="fixed"/>
+        <w:tblW w:w="9072" w:type="dxa"/>
       </w:tblPr>
       <w:tblGrid>
-        <w:gridCol w:w="450"/>
-        <w:gridCol w:w="2500"/>
+        <w:gridCol w:w="500"/>
+        <w:gridCol w:w="3100"/>
         <w:gridCol w:w="550"/>
         <w:gridCol w:w="1000"/>
-        <w:gridCol w:w="1100"/>
-        <w:gridCol w:w="1100"/>
+        <w:gridCol w:w="1961"/>
+        <w:gridCol w:w="1961"/>
       </w:tblGrid>
       <w:tr>
         <w:trPr>
+          <w:tblHeader/>
           <w:cantSplit/>
-          <w:tblHeader/>
         </w:trPr>
         <w:tc>
           <w:tcPr>
@@ -184,6 +216,7 @@
           <w:p>
             <w:pPr>
               <w:spacing w:after="0"/>
+              <w:jc w:val="left"/>
             </w:pPr>
             <w:r>
               <w:rPr>
@@ -210,6 +243,7 @@
           <w:p>
             <w:pPr>
               <w:spacing w:after="0"/>
+              <w:jc w:val="left"/>
             </w:pPr>
             <w:r>
               <w:rPr>
@@ -236,6 +270,7 @@
           <w:p>
             <w:pPr>
               <w:spacing w:after="0"/>
+              <w:jc w:val="left"/>
             </w:pPr>
             <w:r>
               <w:rPr>
@@ -262,6 +297,7 @@
           <w:p>
             <w:pPr>
               <w:spacing w:after="0"/>
+              <w:jc w:val="left"/>
             </w:pPr>
             <w:r>
               <w:rPr>
@@ -288,6 +324,7 @@
           <w:p>
             <w:pPr>
               <w:spacing w:after="0"/>
+              <w:jc w:val="left"/>
             </w:pPr>
             <w:r>
               <w:rPr>
@@ -314,6 +351,7 @@
           <w:p>
             <w:pPr>
               <w:spacing w:after="0"/>
+              <w:jc w:val="left"/>
             </w:pPr>
             <w:r>
               <w:rPr>
@@ -328,6 +366,9 @@
         </w:tc>
       </w:tr>
       <w:tr>
+        <w:trPr>
+          <w:cantSplit/>
+        </w:trPr>
         <w:tc>
           <w:tcPr>
             <w:tcW w:type="dxa" w:w="450"/>
@@ -341,6 +382,7 @@
           <w:p>
             <w:pPr>
               <w:spacing w:after="0"/>
+              <w:jc w:val="left"/>
             </w:pPr>
             <w:r>
               <w:rPr>
@@ -364,6 +406,7 @@
           <w:p>
             <w:pPr>
               <w:spacing w:after="0"/>
+              <w:jc w:val="left"/>
             </w:pPr>
             <w:r>
               <w:rPr>
@@ -387,6 +430,7 @@
           <w:p>
             <w:pPr>
               <w:spacing w:after="0"/>
+              <w:jc w:val="left"/>
             </w:pPr>
             <w:r>
               <w:rPr>
@@ -410,6 +454,7 @@
           <w:p>
             <w:pPr>
               <w:spacing w:after="0"/>
+              <w:jc w:val="left"/>
             </w:pPr>
             <w:r>
               <w:rPr>
@@ -433,6 +478,7 @@
           <w:p>
             <w:pPr>
               <w:spacing w:after="0"/>
+              <w:jc w:val="left"/>
             </w:pPr>
             <w:r>
               <w:rPr>
@@ -456,6 +502,7 @@
           <w:p>
             <w:pPr>
               <w:spacing w:after="0"/>
+              <w:jc w:val="left"/>
             </w:pPr>
             <w:r>
               <w:rPr>
@@ -468,6 +515,9 @@
         </w:tc>
       </w:tr>
       <w:tr>
+        <w:trPr>
+          <w:cantSplit/>
+        </w:trPr>
         <w:tc>
           <w:tcPr>
             <w:tcW w:type="dxa" w:w="450"/>
@@ -481,6 +531,7 @@
           <w:p>
             <w:pPr>
               <w:spacing w:after="0"/>
+              <w:jc w:val="left"/>
             </w:pPr>
             <w:r>
               <w:rPr>
@@ -504,6 +555,7 @@
           <w:p>
             <w:pPr>
               <w:spacing w:after="0"/>
+              <w:jc w:val="left"/>
             </w:pPr>
             <w:r>
               <w:rPr>
@@ -527,6 +579,7 @@
           <w:p>
             <w:pPr>
               <w:spacing w:after="0"/>
+              <w:jc w:val="left"/>
             </w:pPr>
             <w:r>
               <w:rPr>
@@ -550,6 +603,7 @@
           <w:p>
             <w:pPr>
               <w:spacing w:after="0"/>
+              <w:jc w:val="left"/>
             </w:pPr>
             <w:r>
               <w:rPr>
@@ -573,6 +627,7 @@
           <w:p>
             <w:pPr>
               <w:spacing w:after="0"/>
+              <w:jc w:val="left"/>
             </w:pPr>
             <w:r>
               <w:rPr>
@@ -596,6 +651,7 @@
           <w:p>
             <w:pPr>
               <w:spacing w:after="0"/>
+              <w:jc w:val="left"/>
             </w:pPr>
             <w:r>
               <w:rPr>
@@ -608,6 +664,9 @@
         </w:tc>
       </w:tr>
       <w:tr>
+        <w:trPr>
+          <w:cantSplit/>
+        </w:trPr>
         <w:tc>
           <w:tcPr>
             <w:tcW w:type="dxa" w:w="450"/>
@@ -621,6 +680,7 @@
           <w:p>
             <w:pPr>
               <w:spacing w:after="0"/>
+              <w:jc w:val="left"/>
             </w:pPr>
             <w:r>
               <w:rPr>
@@ -644,6 +704,7 @@
           <w:p>
             <w:pPr>
               <w:spacing w:after="0"/>
+              <w:jc w:val="left"/>
             </w:pPr>
             <w:r>
               <w:rPr>
@@ -667,6 +728,7 @@
           <w:p>
             <w:pPr>
               <w:spacing w:after="0"/>
+              <w:jc w:val="left"/>
             </w:pPr>
             <w:r>
               <w:rPr>
@@ -690,6 +752,7 @@
           <w:p>
             <w:pPr>
               <w:spacing w:after="0"/>
+              <w:jc w:val="left"/>
             </w:pPr>
             <w:r>
               <w:rPr>
@@ -713,6 +776,7 @@
           <w:p>
             <w:pPr>
               <w:spacing w:after="0"/>
+              <w:jc w:val="left"/>
             </w:pPr>
             <w:r>
               <w:rPr>
@@ -736,6 +800,7 @@
           <w:p>
             <w:pPr>
               <w:spacing w:after="0"/>
+              <w:jc w:val="left"/>
             </w:pPr>
             <w:r>
               <w:rPr>
@@ -748,6 +813,9 @@
         </w:tc>
       </w:tr>
       <w:tr>
+        <w:trPr>
+          <w:cantSplit/>
+        </w:trPr>
         <w:tc>
           <w:tcPr>
             <w:tcW w:type="dxa" w:w="450"/>
@@ -761,6 +829,7 @@
           <w:p>
             <w:pPr>
               <w:spacing w:after="0"/>
+              <w:jc w:val="left"/>
             </w:pPr>
             <w:r>
               <w:rPr>
@@ -784,6 +853,7 @@
           <w:p>
             <w:pPr>
               <w:spacing w:after="0"/>
+              <w:jc w:val="left"/>
             </w:pPr>
             <w:r>
               <w:rPr>
@@ -807,6 +877,7 @@
           <w:p>
             <w:pPr>
               <w:spacing w:after="0"/>
+              <w:jc w:val="left"/>
             </w:pPr>
             <w:r>
               <w:rPr>
@@ -830,6 +901,7 @@
           <w:p>
             <w:pPr>
               <w:spacing w:after="0"/>
+              <w:jc w:val="left"/>
             </w:pPr>
             <w:r>
               <w:rPr>
@@ -853,6 +925,7 @@
           <w:p>
             <w:pPr>
               <w:spacing w:after="0"/>
+              <w:jc w:val="left"/>
             </w:pPr>
             <w:r>
               <w:rPr>
@@ -876,6 +949,7 @@
           <w:p>
             <w:pPr>
               <w:spacing w:after="0"/>
+              <w:jc w:val="left"/>
             </w:pPr>
             <w:r>
               <w:rPr>
@@ -888,6 +962,9 @@
         </w:tc>
       </w:tr>
       <w:tr>
+        <w:trPr>
+          <w:cantSplit/>
+        </w:trPr>
         <w:tc>
           <w:tcPr>
             <w:tcW w:type="dxa" w:w="450"/>
@@ -901,6 +978,7 @@
           <w:p>
             <w:pPr>
               <w:spacing w:after="0"/>
+              <w:jc w:val="left"/>
             </w:pPr>
             <w:r>
               <w:rPr>
@@ -924,6 +1002,7 @@
           <w:p>
             <w:pPr>
               <w:spacing w:after="0"/>
+              <w:jc w:val="left"/>
             </w:pPr>
             <w:r>
               <w:rPr>
@@ -947,6 +1026,7 @@
           <w:p>
             <w:pPr>
               <w:spacing w:after="0"/>
+              <w:jc w:val="left"/>
             </w:pPr>
             <w:r>
               <w:rPr>
@@ -970,6 +1050,7 @@
           <w:p>
             <w:pPr>
               <w:spacing w:after="0"/>
+              <w:jc w:val="left"/>
             </w:pPr>
             <w:r>
               <w:rPr>
@@ -993,6 +1074,7 @@
           <w:p>
             <w:pPr>
               <w:spacing w:after="0"/>
+              <w:jc w:val="left"/>
             </w:pPr>
             <w:r>
               <w:rPr>
@@ -1016,6 +1098,7 @@
           <w:p>
             <w:pPr>
               <w:spacing w:after="0"/>
+              <w:jc w:val="left"/>
             </w:pPr>
             <w:r>
               <w:rPr>
@@ -1028,6 +1111,9 @@
         </w:tc>
       </w:tr>
       <w:tr>
+        <w:trPr>
+          <w:cantSplit/>
+        </w:trPr>
         <w:tc>
           <w:tcPr>
             <w:tcW w:type="dxa" w:w="450"/>
@@ -1041,6 +1127,7 @@
           <w:p>
             <w:pPr>
               <w:spacing w:after="0"/>
+              <w:jc w:val="left"/>
             </w:pPr>
             <w:r>
               <w:rPr>
@@ -1064,6 +1151,7 @@
           <w:p>
             <w:pPr>
               <w:spacing w:after="0"/>
+              <w:jc w:val="left"/>
             </w:pPr>
             <w:r>
               <w:rPr>
@@ -1087,6 +1175,7 @@
           <w:p>
             <w:pPr>
               <w:spacing w:after="0"/>
+              <w:jc w:val="left"/>
             </w:pPr>
             <w:r>
               <w:rPr>
@@ -1110,6 +1199,7 @@
           <w:p>
             <w:pPr>
               <w:spacing w:after="0"/>
+              <w:jc w:val="left"/>
             </w:pPr>
             <w:r>
               <w:rPr>
@@ -1133,6 +1223,7 @@
           <w:p>
             <w:pPr>
               <w:spacing w:after="0"/>
+              <w:jc w:val="left"/>
             </w:pPr>
             <w:r>
               <w:rPr>
@@ -1156,6 +1247,7 @@
           <w:p>
             <w:pPr>
               <w:spacing w:after="0"/>
+              <w:jc w:val="left"/>
             </w:pPr>
             <w:r>
               <w:rPr>
@@ -1168,6 +1260,9 @@
         </w:tc>
       </w:tr>
       <w:tr>
+        <w:trPr>
+          <w:cantSplit/>
+        </w:trPr>
         <w:tc>
           <w:tcPr>
             <w:tcW w:type="dxa" w:w="450"/>
@@ -1181,6 +1276,7 @@
           <w:p>
             <w:pPr>
               <w:spacing w:after="0"/>
+              <w:jc w:val="left"/>
             </w:pPr>
             <w:r>
               <w:rPr>
@@ -1204,6 +1300,7 @@
           <w:p>
             <w:pPr>
               <w:spacing w:after="0"/>
+              <w:jc w:val="left"/>
             </w:pPr>
             <w:r>
               <w:rPr>
@@ -1227,6 +1324,7 @@
           <w:p>
             <w:pPr>
               <w:spacing w:after="0"/>
+              <w:jc w:val="left"/>
             </w:pPr>
             <w:r>
               <w:rPr>
@@ -1250,6 +1348,7 @@
           <w:p>
             <w:pPr>
               <w:spacing w:after="0"/>
+              <w:jc w:val="left"/>
             </w:pPr>
             <w:r>
               <w:rPr>
@@ -1273,6 +1372,7 @@
           <w:p>
             <w:pPr>
               <w:spacing w:after="0"/>
+              <w:jc w:val="left"/>
             </w:pPr>
             <w:r>
               <w:rPr>
@@ -1296,6 +1396,7 @@
           <w:p>
             <w:pPr>
               <w:spacing w:after="0"/>
+              <w:jc w:val="left"/>
             </w:pPr>
             <w:r>
               <w:rPr>
@@ -1308,6 +1409,9 @@
         </w:tc>
       </w:tr>
       <w:tr>
+        <w:trPr>
+          <w:cantSplit/>
+        </w:trPr>
         <w:tc>
           <w:tcPr>
             <w:tcW w:type="dxa" w:w="450"/>
@@ -1321,6 +1425,7 @@
           <w:p>
             <w:pPr>
               <w:spacing w:after="0"/>
+              <w:jc w:val="left"/>
             </w:pPr>
             <w:r>
               <w:rPr>
@@ -1344,6 +1449,7 @@
           <w:p>
             <w:pPr>
               <w:spacing w:after="0"/>
+              <w:jc w:val="left"/>
             </w:pPr>
             <w:r>
               <w:rPr>
@@ -1367,6 +1473,7 @@
           <w:p>
             <w:pPr>
               <w:spacing w:after="0"/>
+              <w:jc w:val="left"/>
             </w:pPr>
             <w:r>
               <w:rPr>
@@ -1390,6 +1497,7 @@
           <w:p>
             <w:pPr>
               <w:spacing w:after="0"/>
+              <w:jc w:val="left"/>
             </w:pPr>
             <w:r>
               <w:rPr>
@@ -1413,6 +1521,7 @@
           <w:p>
             <w:pPr>
               <w:spacing w:after="0"/>
+              <w:jc w:val="left"/>
             </w:pPr>
             <w:r>
               <w:rPr>
@@ -1436,6 +1545,7 @@
           <w:p>
             <w:pPr>
               <w:spacing w:after="0"/>
+              <w:jc w:val="left"/>
             </w:pPr>
             <w:r>
               <w:rPr>
@@ -1448,6 +1558,9 @@
         </w:tc>
       </w:tr>
       <w:tr>
+        <w:trPr>
+          <w:cantSplit/>
+        </w:trPr>
         <w:tc>
           <w:tcPr>
             <w:tcW w:type="dxa" w:w="450"/>
@@ -1461,6 +1574,7 @@
           <w:p>
             <w:pPr>
               <w:spacing w:after="0"/>
+              <w:jc w:val="left"/>
             </w:pPr>
             <w:r>
               <w:rPr>
@@ -1484,6 +1598,7 @@
           <w:p>
             <w:pPr>
               <w:spacing w:after="0"/>
+              <w:jc w:val="left"/>
             </w:pPr>
             <w:r>
               <w:rPr>
@@ -1507,6 +1622,7 @@
           <w:p>
             <w:pPr>
               <w:spacing w:after="0"/>
+              <w:jc w:val="left"/>
             </w:pPr>
             <w:r>
               <w:rPr>
@@ -1530,6 +1646,7 @@
           <w:p>
             <w:pPr>
               <w:spacing w:after="0"/>
+              <w:jc w:val="left"/>
             </w:pPr>
             <w:r>
               <w:rPr>
@@ -1553,6 +1670,7 @@
           <w:p>
             <w:pPr>
               <w:spacing w:after="0"/>
+              <w:jc w:val="left"/>
             </w:pPr>
             <w:r>
               <w:rPr>
@@ -1576,6 +1694,7 @@
           <w:p>
             <w:pPr>
               <w:spacing w:after="0"/>
+              <w:jc w:val="left"/>
             </w:pPr>
             <w:r>
               <w:rPr>
@@ -1588,6 +1707,9 @@
         </w:tc>
       </w:tr>
       <w:tr>
+        <w:trPr>
+          <w:cantSplit/>
+        </w:trPr>
         <w:tc>
           <w:tcPr>
             <w:tcW w:type="dxa" w:w="450"/>
@@ -1601,6 +1723,7 @@
           <w:p>
             <w:pPr>
               <w:spacing w:after="0"/>
+              <w:jc w:val="left"/>
             </w:pPr>
             <w:r>
               <w:rPr>
@@ -1624,6 +1747,7 @@
           <w:p>
             <w:pPr>
               <w:spacing w:after="0"/>
+              <w:jc w:val="left"/>
             </w:pPr>
             <w:r>
               <w:rPr>
@@ -1647,6 +1771,7 @@
           <w:p>
             <w:pPr>
               <w:spacing w:after="0"/>
+              <w:jc w:val="left"/>
             </w:pPr>
             <w:r>
               <w:rPr>
@@ -1670,6 +1795,7 @@
           <w:p>
             <w:pPr>
               <w:spacing w:after="0"/>
+              <w:jc w:val="left"/>
             </w:pPr>
             <w:r>
               <w:rPr>
@@ -1693,6 +1819,7 @@
           <w:p>
             <w:pPr>
               <w:spacing w:after="0"/>
+              <w:jc w:val="left"/>
             </w:pPr>
             <w:r>
               <w:rPr>
@@ -1716,6 +1843,7 @@
           <w:p>
             <w:pPr>
               <w:spacing w:after="0"/>
+              <w:jc w:val="left"/>
             </w:pPr>
             <w:r>
               <w:rPr>
@@ -1728,6 +1856,9 @@
         </w:tc>
       </w:tr>
       <w:tr>
+        <w:trPr>
+          <w:cantSplit/>
+        </w:trPr>
         <w:tc>
           <w:tcPr>
             <w:tcW w:type="dxa" w:w="450"/>
@@ -1741,6 +1872,7 @@
           <w:p>
             <w:pPr>
               <w:spacing w:after="0"/>
+              <w:jc w:val="left"/>
             </w:pPr>
             <w:r>
               <w:rPr>
@@ -1764,6 +1896,7 @@
           <w:p>
             <w:pPr>
               <w:spacing w:after="0"/>
+              <w:jc w:val="left"/>
             </w:pPr>
             <w:r>
               <w:rPr>
@@ -1787,6 +1920,7 @@
           <w:p>
             <w:pPr>
               <w:spacing w:after="0"/>
+              <w:jc w:val="left"/>
             </w:pPr>
             <w:r>
               <w:rPr>
@@ -1810,6 +1944,7 @@
           <w:p>
             <w:pPr>
               <w:spacing w:after="0"/>
+              <w:jc w:val="left"/>
             </w:pPr>
             <w:r>
               <w:rPr>
@@ -1833,6 +1968,7 @@
           <w:p>
             <w:pPr>
               <w:spacing w:after="0"/>
+              <w:jc w:val="left"/>
             </w:pPr>
             <w:r>
               <w:rPr>
@@ -1856,6 +1992,7 @@
           <w:p>
             <w:pPr>
               <w:spacing w:after="0"/>
+              <w:jc w:val="left"/>
             </w:pPr>
             <w:r>
               <w:rPr>
@@ -1868,6 +2005,9 @@
         </w:tc>
       </w:tr>
       <w:tr>
+        <w:trPr>
+          <w:cantSplit/>
+        </w:trPr>
         <w:tc>
           <w:tcPr>
             <w:tcW w:type="dxa" w:w="450"/>
@@ -1881,6 +2021,7 @@
           <w:p>
             <w:pPr>
               <w:spacing w:after="0"/>
+              <w:jc w:val="left"/>
             </w:pPr>
             <w:r>
               <w:rPr>
@@ -1904,6 +2045,7 @@
           <w:p>
             <w:pPr>
               <w:spacing w:after="0"/>
+              <w:jc w:val="left"/>
             </w:pPr>
             <w:r>
               <w:rPr>
@@ -1927,6 +2069,7 @@
           <w:p>
             <w:pPr>
               <w:spacing w:after="0"/>
+              <w:jc w:val="left"/>
             </w:pPr>
             <w:r>
               <w:rPr>
@@ -1950,6 +2093,7 @@
           <w:p>
             <w:pPr>
               <w:spacing w:after="0"/>
+              <w:jc w:val="left"/>
             </w:pPr>
             <w:r>
               <w:rPr>
@@ -1973,6 +2117,7 @@
           <w:p>
             <w:pPr>
               <w:spacing w:after="0"/>
+              <w:jc w:val="left"/>
             </w:pPr>
             <w:r>
               <w:rPr>
@@ -1996,6 +2141,7 @@
           <w:p>
             <w:pPr>
               <w:spacing w:after="0"/>
+              <w:jc w:val="left"/>
             </w:pPr>
             <w:r>
               <w:rPr>
@@ -2008,6 +2154,9 @@
         </w:tc>
       </w:tr>
       <w:tr>
+        <w:trPr>
+          <w:cantSplit/>
+        </w:trPr>
         <w:tc>
           <w:tcPr>
             <w:tcW w:type="dxa" w:w="450"/>
@@ -2021,6 +2170,7 @@
           <w:p>
             <w:pPr>
               <w:spacing w:after="0"/>
+              <w:jc w:val="left"/>
             </w:pPr>
             <w:r>
               <w:rPr>
@@ -2044,6 +2194,7 @@
           <w:p>
             <w:pPr>
               <w:spacing w:after="0"/>
+              <w:jc w:val="left"/>
             </w:pPr>
             <w:r>
               <w:rPr>
@@ -2067,6 +2218,7 @@
           <w:p>
             <w:pPr>
               <w:spacing w:after="0"/>
+              <w:jc w:val="left"/>
             </w:pPr>
             <w:r>
               <w:rPr>
@@ -2090,6 +2242,7 @@
           <w:p>
             <w:pPr>
               <w:spacing w:after="0"/>
+              <w:jc w:val="left"/>
             </w:pPr>
             <w:r>
               <w:rPr>
@@ -2113,6 +2266,7 @@
           <w:p>
             <w:pPr>
               <w:spacing w:after="0"/>
+              <w:jc w:val="left"/>
             </w:pPr>
             <w:r>
               <w:rPr>
@@ -2136,6 +2290,7 @@
           <w:p>
             <w:pPr>
               <w:spacing w:after="0"/>
+              <w:jc w:val="left"/>
             </w:pPr>
             <w:r>
               <w:rPr>
@@ -2148,6 +2303,9 @@
         </w:tc>
       </w:tr>
       <w:tr>
+        <w:trPr>
+          <w:cantSplit/>
+        </w:trPr>
         <w:tc>
           <w:tcPr>
             <w:tcW w:type="dxa" w:w="450"/>
@@ -2161,6 +2319,7 @@
           <w:p>
             <w:pPr>
               <w:spacing w:after="0"/>
+              <w:jc w:val="left"/>
             </w:pPr>
             <w:r>
               <w:rPr>
@@ -2184,6 +2343,7 @@
           <w:p>
             <w:pPr>
               <w:spacing w:after="0"/>
+              <w:jc w:val="left"/>
             </w:pPr>
             <w:r>
               <w:rPr>
@@ -2207,6 +2367,7 @@
           <w:p>
             <w:pPr>
               <w:spacing w:after="0"/>
+              <w:jc w:val="left"/>
             </w:pPr>
             <w:r>
               <w:rPr>
@@ -2230,6 +2391,7 @@
           <w:p>
             <w:pPr>
               <w:spacing w:after="0"/>
+              <w:jc w:val="left"/>
             </w:pPr>
             <w:r>
               <w:rPr>
@@ -2253,6 +2415,7 @@
           <w:p>
             <w:pPr>
               <w:spacing w:after="0"/>
+              <w:jc w:val="left"/>
             </w:pPr>
             <w:r>
               <w:rPr>
@@ -2276,6 +2439,7 @@
           <w:p>
             <w:pPr>
               <w:spacing w:after="0"/>
+              <w:jc w:val="left"/>
             </w:pPr>
             <w:r>
               <w:rPr>
@@ -2288,6 +2452,9 @@
         </w:tc>
       </w:tr>
       <w:tr>
+        <w:trPr>
+          <w:cantSplit/>
+        </w:trPr>
         <w:tc>
           <w:tcPr>
             <w:tcW w:type="dxa" w:w="450"/>
@@ -2301,6 +2468,7 @@
           <w:p>
             <w:pPr>
               <w:spacing w:after="0"/>
+              <w:jc w:val="left"/>
             </w:pPr>
             <w:r>
               <w:rPr>
@@ -2324,6 +2492,7 @@
           <w:p>
             <w:pPr>
               <w:spacing w:after="0"/>
+              <w:jc w:val="left"/>
             </w:pPr>
             <w:r>
               <w:rPr>
@@ -2347,6 +2516,7 @@
           <w:p>
             <w:pPr>
               <w:spacing w:after="0"/>
+              <w:jc w:val="left"/>
             </w:pPr>
             <w:r>
               <w:rPr>
@@ -2370,6 +2540,7 @@
           <w:p>
             <w:pPr>
               <w:spacing w:after="0"/>
+              <w:jc w:val="left"/>
             </w:pPr>
             <w:r>
               <w:rPr>
@@ -2393,6 +2564,7 @@
           <w:p>
             <w:pPr>
               <w:spacing w:after="0"/>
+              <w:jc w:val="left"/>
             </w:pPr>
             <w:r>
               <w:rPr>
@@ -2416,6 +2588,7 @@
           <w:p>
             <w:pPr>
               <w:spacing w:after="0"/>
+              <w:jc w:val="left"/>
             </w:pPr>
             <w:r>
               <w:rPr>
@@ -2428,6 +2601,9 @@
         </w:tc>
       </w:tr>
       <w:tr>
+        <w:trPr>
+          <w:cantSplit/>
+        </w:trPr>
         <w:tc>
           <w:tcPr>
             <w:tcW w:type="dxa" w:w="450"/>
@@ -2441,6 +2617,7 @@
           <w:p>
             <w:pPr>
               <w:spacing w:after="0"/>
+              <w:jc w:val="left"/>
             </w:pPr>
             <w:r>
               <w:rPr>
@@ -2464,6 +2641,7 @@
           <w:p>
             <w:pPr>
               <w:spacing w:after="0"/>
+              <w:jc w:val="left"/>
             </w:pPr>
             <w:r>
               <w:rPr>
@@ -2487,6 +2665,7 @@
           <w:p>
             <w:pPr>
               <w:spacing w:after="0"/>
+              <w:jc w:val="left"/>
             </w:pPr>
             <w:r>
               <w:rPr>
@@ -2510,6 +2689,7 @@
           <w:p>
             <w:pPr>
               <w:spacing w:after="0"/>
+              <w:jc w:val="left"/>
             </w:pPr>
             <w:r>
               <w:rPr>
@@ -2533,6 +2713,7 @@
           <w:p>
             <w:pPr>
               <w:spacing w:after="0"/>
+              <w:jc w:val="left"/>
             </w:pPr>
             <w:r>
               <w:rPr>
@@ -2556,6 +2737,7 @@
           <w:p>
             <w:pPr>
               <w:spacing w:after="0"/>
+              <w:jc w:val="left"/>
             </w:pPr>
             <w:r>
               <w:rPr>
@@ -2568,6 +2750,9 @@
         </w:tc>
       </w:tr>
       <w:tr>
+        <w:trPr>
+          <w:cantSplit/>
+        </w:trPr>
         <w:tc>
           <w:tcPr>
             <w:tcW w:type="dxa" w:w="450"/>
@@ -2581,6 +2766,7 @@
           <w:p>
             <w:pPr>
               <w:spacing w:after="0"/>
+              <w:jc w:val="left"/>
             </w:pPr>
             <w:r>
               <w:rPr>
@@ -2604,6 +2790,7 @@
           <w:p>
             <w:pPr>
               <w:spacing w:after="0"/>
+              <w:jc w:val="left"/>
             </w:pPr>
             <w:r>
               <w:rPr>
@@ -2627,6 +2814,7 @@
           <w:p>
             <w:pPr>
               <w:spacing w:after="0"/>
+              <w:jc w:val="left"/>
             </w:pPr>
             <w:r>
               <w:rPr>
@@ -2650,6 +2838,7 @@
           <w:p>
             <w:pPr>
               <w:spacing w:after="0"/>
+              <w:jc w:val="left"/>
             </w:pPr>
             <w:r>
               <w:rPr>
@@ -2673,6 +2862,7 @@
           <w:p>
             <w:pPr>
               <w:spacing w:after="0"/>
+              <w:jc w:val="left"/>
             </w:pPr>
             <w:r>
               <w:rPr>
@@ -2696,6 +2886,7 @@
           <w:p>
             <w:pPr>
               <w:spacing w:after="0"/>
+              <w:jc w:val="left"/>
             </w:pPr>
             <w:r>
               <w:rPr>
@@ -2708,6 +2899,9 @@
         </w:tc>
       </w:tr>
       <w:tr>
+        <w:trPr>
+          <w:cantSplit/>
+        </w:trPr>
         <w:tc>
           <w:tcPr>
             <w:tcW w:type="dxa" w:w="450"/>
@@ -2721,6 +2915,7 @@
           <w:p>
             <w:pPr>
               <w:spacing w:after="0"/>
+              <w:jc w:val="left"/>
             </w:pPr>
             <w:r>
               <w:rPr>
@@ -2744,6 +2939,7 @@
           <w:p>
             <w:pPr>
               <w:spacing w:after="0"/>
+              <w:jc w:val="left"/>
             </w:pPr>
             <w:r>
               <w:rPr>
@@ -2767,6 +2963,7 @@
           <w:p>
             <w:pPr>
               <w:spacing w:after="0"/>
+              <w:jc w:val="left"/>
             </w:pPr>
             <w:r>
               <w:rPr>
@@ -2790,6 +2987,7 @@
           <w:p>
             <w:pPr>
               <w:spacing w:after="0"/>
+              <w:jc w:val="left"/>
             </w:pPr>
             <w:r>
               <w:rPr>
@@ -2813,6 +3011,7 @@
           <w:p>
             <w:pPr>
               <w:spacing w:after="0"/>
+              <w:jc w:val="left"/>
             </w:pPr>
             <w:r>
               <w:rPr>
@@ -2836,6 +3035,7 @@
           <w:p>
             <w:pPr>
               <w:spacing w:after="0"/>
+              <w:jc w:val="left"/>
             </w:pPr>
             <w:r>
               <w:rPr>
@@ -2848,6 +3048,9 @@
         </w:tc>
       </w:tr>
       <w:tr>
+        <w:trPr>
+          <w:cantSplit/>
+        </w:trPr>
         <w:tc>
           <w:tcPr>
             <w:tcW w:type="dxa" w:w="450"/>
@@ -2861,6 +3064,7 @@
           <w:p>
             <w:pPr>
               <w:spacing w:after="0"/>
+              <w:jc w:val="left"/>
             </w:pPr>
             <w:r>
               <w:rPr>
@@ -2884,6 +3088,7 @@
           <w:p>
             <w:pPr>
               <w:spacing w:after="0"/>
+              <w:jc w:val="left"/>
             </w:pPr>
             <w:r>
               <w:rPr>
@@ -2907,6 +3112,7 @@
           <w:p>
             <w:pPr>
               <w:spacing w:after="0"/>
+              <w:jc w:val="left"/>
             </w:pPr>
             <w:r>
               <w:rPr>
@@ -2930,6 +3136,7 @@
           <w:p>
             <w:pPr>
               <w:spacing w:after="0"/>
+              <w:jc w:val="left"/>
             </w:pPr>
             <w:r>
               <w:rPr>
@@ -2953,6 +3160,7 @@
           <w:p>
             <w:pPr>
               <w:spacing w:after="0"/>
+              <w:jc w:val="left"/>
             </w:pPr>
             <w:r>
               <w:rPr>
@@ -2976,6 +3184,7 @@
           <w:p>
             <w:pPr>
               <w:spacing w:after="0"/>
+              <w:jc w:val="left"/>
             </w:pPr>
             <w:r>
               <w:rPr>
@@ -2988,6 +3197,9 @@
         </w:tc>
       </w:tr>
       <w:tr>
+        <w:trPr>
+          <w:cantSplit/>
+        </w:trPr>
         <w:tc>
           <w:tcPr>
             <w:tcW w:type="dxa" w:w="450"/>
@@ -3001,6 +3213,7 @@
           <w:p>
             <w:pPr>
               <w:spacing w:after="0"/>
+              <w:jc w:val="left"/>
             </w:pPr>
             <w:r>
               <w:rPr>
@@ -3024,6 +3237,7 @@
           <w:p>
             <w:pPr>
               <w:spacing w:after="0"/>
+              <w:jc w:val="left"/>
             </w:pPr>
             <w:r>
               <w:rPr>
@@ -3047,6 +3261,7 @@
           <w:p>
             <w:pPr>
               <w:spacing w:after="0"/>
+              <w:jc w:val="left"/>
             </w:pPr>
             <w:r>
               <w:rPr>
@@ -3070,6 +3285,7 @@
           <w:p>
             <w:pPr>
               <w:spacing w:after="0"/>
+              <w:jc w:val="left"/>
             </w:pPr>
             <w:r>
               <w:rPr>
@@ -3093,6 +3309,7 @@
           <w:p>
             <w:pPr>
               <w:spacing w:after="0"/>
+              <w:jc w:val="left"/>
             </w:pPr>
             <w:r>
               <w:rPr>
@@ -3116,6 +3333,7 @@
           <w:p>
             <w:pPr>
               <w:spacing w:after="0"/>
+              <w:jc w:val="left"/>
             </w:pPr>
             <w:r>
               <w:rPr>

</xml_diff>

<commit_message>
auditoria final: corrige B1, B2, B3, M1, M2, M4, I3, I7 e I9
</commit_message>
<xml_diff>
--- a/deliverables/EGMS_01_resumo_executivo.docx
+++ b/deliverables/EGMS_01_resumo_executivo.docx
@@ -3491,7 +3491,7 @@
         <w:t xml:space="preserve">O índice se deixa testar. </w:t>
       </w:r>
       <w:r>
-        <w:t xml:space="preserve">Cumaru do Norte (PA, 12º) mostra o que o índice não distingue sozinho: 112 autos e R$ 761,9 milhões deflacionados em 12 dos 18 anos, com desmatamento persistente. É presença federal sem efeito, não ausência. Apuí (AM) mostra o instrumento funcionando no tempo: pior trecho sustentado em 2020–22 (desmatamento a 440 km²/ano, resposta estagnada) e queda do EGS quando a resposta federal e estadual chega em 2023–25, e o município cai para a posição 141. Um monitor que nunca rebaixa ninguém não está medindo nada.</w:t>
+        <w:t>Cumaru do Norte (PA, 12º) mostra o que o índice não distingue sozinho: 112 autos e R$ 761,9 milhões deflacionados em 12 dos 18 anos, com desmatamento persistente. É compatível com presença federal sem efeito, não com ausência. Apuí (AM) mostra o instrumento funcionando no tempo: pior trecho sustentado em 2020–22 (desmatamento a 440 km²/ano, resposta estagnada) e queda do EGS quando a resposta federal e estadual chega em 2023–25, e o município cai para a posição 141. Um monitor que nunca rebaixa ninguém não está medindo nada.</w:t>
       </w:r>
     </w:p>
     <w:p>
@@ -3499,7 +3499,7 @@
         <w:ind w:firstLine="709"/>
       </w:pPr>
       <w:r>
-        <w:t>A série mostra, ano a ano, a situação anual dos 772 municípios (lacuna absoluta, lacuna medida ou sem pressão) e a área total desmatada, em dois painéis sobre o mesmo eixo de anos, sem eixo secundário: alinhar duas unidades num eixo só exige um fator de escala arbitrário, e o ponto em que as curvas parecem se cruzar seria artefato desse fator. A faixa marca 2020 a 2022, os anos em que a lacuna absoluta supera a medida, e o quadro revela o choque de capacidade fiscalizatória entre 2019 e 2022.</w:t>
+        <w:t>A série mostra, ano a ano, a situação anual dos 772 municípios (lacuna absoluta, lacuna medida ou sem pressão) e a área total desmatada, em dois painéis sobre o mesmo eixo de anos, sem eixo secundário: alinhar duas unidades num eixo só exige um fator de escala arbitrário, e o ponto em que as curvas parecem se cruzar seria artefato desse fator. A faixa marca 2020 a 2022, o choque de capacidade fiscalizatória, e o quadro revela o choque de capacidade fiscalizatória entre 2019 e 2022.</w:t>
       </w:r>
     </w:p>
     <w:p>
@@ -3551,7 +3551,7 @@
           <w:color w:val="000000"/>
           <w:sz w:val="18"/>
         </w:rPr>
-        <w:t>Figura 3. Série anual: situação dos 772 municípios e área total desmatada, em painéis separados sobre o mesmo eixo de anos. A faixa marca 2020-2022, os anos em que a lacuna absoluta supera a medida.</w:t>
+        <w:t>Figura 3. Série anual: situação dos 772 municípios e área total desmatada, em painéis separados sobre o mesmo eixo de anos. A faixa marca 2020-2022, o choque de capacidade fiscalizatória. A lacuna absoluta também supera a medida em 2010 e 2014, fora da faixa e em magnitude bem menor.</w:t>
       </w:r>
     </w:p>
     <w:p>
@@ -3591,7 +3591,7 @@
         <w:t xml:space="preserve">federal</w:t>
       </w:r>
       <w:r>
-        <w:t xml:space="preserve"> (aparatos estaduais ativos, como SEMAS-PA e IPAAM, são invisíveis ao dado, e mesmo no plano federal só entram autos de tipo desmatamento: 34% dos que o IBAMA lavrou no top 20); PRODES não distingue desmatamento autorizado de ilegal; a resposta é medida por autos lavrados, não por embargos ou arrecadação; o EGS é ordinal. Cada posição do ranking é uma hipótese priorizada para investigação: não um veredito.</w:t>
+        <w:t xml:space="preserve"> (aparatos estaduais ativos, como SEMAS-PA e IPAAM, são invisíveis ao dado, e mesmo no plano federal só entram autos de tipo desmatamento: cerca de 39% dos que o IBAMA lavrou no top 20); PRODES não distingue desmatamento autorizado de ilegal; a resposta é medida por autos lavrados, não por embargos ou arrecadação; o EGS é ordinal. Cada posição do ranking é uma hipótese priorizada para investigação: não um veredito.</w:t>
       </w:r>
     </w:p>
     <w:p>

</xml_diff>